<commit_message>
Atualizar proposta e incluir PDF da documentação técnica
</commit_message>
<xml_diff>
--- a/documentacao/saida/Proposta_Desenvolvimento_MOVEON.docx
+++ b/documentacao/saida/Proposta_Desenvolvimento_MOVEON.docx
@@ -1,6 +1,6 @@
 
 <file path=word/document.xml><?xml version="1.0" encoding="utf-8"?>
-<w:document xmlns:wpc="http://schemas.microsoft.com/office/word/2010/wordprocessingCanvas" xmlns:cx="http://schemas.microsoft.com/office/drawing/2014/chartex" xmlns:cx1="http://schemas.microsoft.com/office/drawing/2015/9/8/chartex" xmlns:cx2="http://schemas.microsoft.com/office/drawing/2015/10/21/chartex" xmlns:cx3="http://schemas.microsoft.com/office/drawing/2016/5/9/chartex" xmlns:cx4="http://schemas.microsoft.com/office/drawing/2016/5/10/chartex" xmlns:cx5="http://schemas.microsoft.com/office/drawing/2016/5/11/chartex" xmlns:cx6="http://schemas.microsoft.com/office/drawing/2016/5/12/chartex" xmlns:cx7="http://schemas.microsoft.com/office/drawing/2016/5/13/chartex" xmlns:cx8="http://schemas.microsoft.com/office/drawing/2016/5/14/chartex" xmlns:mc="http://schemas.openxmlformats.org/markup-compatibility/2006" xmlns:aink="http://schemas.microsoft.com/office/drawing/2016/ink" xmlns:am3d="http://schemas.microsoft.com/office/drawing/2017/model3d" xmlns:o="urn:schemas-microsoft-com:office:office" xmlns:oel="http://schemas.microsoft.com/office/2019/extlst" xmlns:r="http://schemas.openxmlformats.org/officeDocument/2006/relationships" xmlns:m="http://schemas.openxmlformats.org/officeDocument/2006/math" xmlns:v="urn:schemas-microsoft-com:vml" xmlns:wp14="http://schemas.microsoft.com/office/word/2010/wordprocessingDrawing" xmlns:wp="http://schemas.openxmlformats.org/drawingml/2006/wordprocessingDrawing" xmlns:w10="urn:schemas-microsoft-com:office:word" xmlns:w="http://schemas.openxmlformats.org/wordprocessingml/2006/main" xmlns:w14="http://schemas.microsoft.com/office/word/2010/wordml" xmlns:w15="http://schemas.microsoft.com/office/word/2012/wordml" xmlns:w16cei="http://schemas.microsoft.com/office/word/2026/wordml/cei" xmlns:w16cex="http://schemas.microsoft.com/office/word/2018/wordml/cex" xmlns:w16cid="http://schemas.microsoft.com/office/word/2016/wordml/cid" xmlns:w16="http://schemas.microsoft.com/office/word/2018/wordml" xmlns:w16du="http://schemas.microsoft.com/office/word/2023/wordml/word16du" xmlns:w16sdtdh="http://schemas.microsoft.com/office/word/2020/wordml/sdtdatahash" xmlns:w16sdtfl="http://schemas.microsoft.com/office/word/2024/wordml/sdtformatlock" xmlns:w16se="http://schemas.microsoft.com/office/word/2015/wordml/symex" xmlns:wpg="http://schemas.microsoft.com/office/word/2010/wordprocessingGroup" xmlns:wpi="http://schemas.microsoft.com/office/word/2010/wordprocessingInk" xmlns:wne="http://schemas.microsoft.com/office/word/2006/wordml" xmlns:wps="http://schemas.microsoft.com/office/word/2010/wordprocessingShape" mc:Ignorable="w14 w15 w16se w16cid w16 w16cex w16sdtdh w16sdtfl w16du wp14">
+<w:document xmlns:wpc="http://schemas.microsoft.com/office/word/2010/wordprocessingCanvas" xmlns:cx="http://schemas.microsoft.com/office/drawing/2014/chartex" xmlns:cx1="http://schemas.microsoft.com/office/drawing/2015/9/8/chartex" xmlns:cx2="http://schemas.microsoft.com/office/drawing/2015/10/21/chartex" xmlns:cx3="http://schemas.microsoft.com/office/drawing/2016/5/9/chartex" xmlns:cx4="http://schemas.microsoft.com/office/drawing/2016/5/10/chartex" xmlns:cx5="http://schemas.microsoft.com/office/drawing/2016/5/11/chartex" xmlns:cx6="http://schemas.microsoft.com/office/drawing/2016/5/12/chartex" xmlns:cx7="http://schemas.microsoft.com/office/drawing/2016/5/13/chartex" xmlns:cx8="http://schemas.microsoft.com/office/drawing/2016/5/14/chartex" xmlns:mc="http://schemas.openxmlformats.org/markup-compatibility/2006" xmlns:aink="http://schemas.microsoft.com/office/drawing/2016/ink" xmlns:am3d="http://schemas.microsoft.com/office/drawing/2017/model3d" xmlns:o="urn:schemas-microsoft-com:office:office" xmlns:oel="http://schemas.microsoft.com/office/2019/extlst" xmlns:r="http://schemas.openxmlformats.org/officeDocument/2006/relationships" xmlns:m="http://schemas.openxmlformats.org/officeDocument/2006/math" xmlns:v="urn:schemas-microsoft-com:vml" xmlns:wp14="http://schemas.microsoft.com/office/word/2010/wordprocessingDrawing" xmlns:wp="http://schemas.openxmlformats.org/drawingml/2006/wordprocessingDrawing" xmlns:w10="urn:schemas-microsoft-com:office:word" xmlns:w="http://schemas.openxmlformats.org/wordprocessingml/2006/main" xmlns:w14="http://schemas.microsoft.com/office/word/2010/wordml" xmlns:w15="http://schemas.microsoft.com/office/word/2012/wordml" xmlns:w16cex="http://schemas.microsoft.com/office/word/2018/wordml/cex" xmlns:w16cid="http://schemas.microsoft.com/office/word/2016/wordml/cid" xmlns:w16="http://schemas.microsoft.com/office/word/2018/wordml" xmlns:w16du="http://schemas.microsoft.com/office/word/2023/wordml/word16du" xmlns:w16sdtdh="http://schemas.microsoft.com/office/word/2020/wordml/sdtdatahash" xmlns:w16sdtfl="http://schemas.microsoft.com/office/word/2024/wordml/sdtformatlock" xmlns:w16se="http://schemas.microsoft.com/office/word/2015/wordml/symex" xmlns:wpg="http://schemas.microsoft.com/office/word/2010/wordprocessingGroup" xmlns:wpi="http://schemas.microsoft.com/office/word/2010/wordprocessingInk" xmlns:wne="http://schemas.microsoft.com/office/word/2006/wordml" xmlns:wps="http://schemas.microsoft.com/office/word/2010/wordprocessingShape" mc:Ignorable="w14 w15 w16se w16cid w16 w16cex w16sdtdh w16sdtfl w16du wp14">
   <w:body>
     <w:p>
       <w:pPr>
@@ -179,21 +179,12 @@
                 <w:szCs w:val="24"/>
               </w:rPr>
             </w:pPr>
-            <w:proofErr w:type="spellStart"/>
             <w:r>
               <w:rPr>
                 <w:sz w:val="24"/>
                 <w:szCs w:val="24"/>
               </w:rPr>
-              <w:t>Contratado</w:t>
-            </w:r>
-            <w:proofErr w:type="spellEnd"/>
-            <w:r>
-              <w:rPr>
-                <w:sz w:val="24"/>
-                <w:szCs w:val="24"/>
-              </w:rPr>
-              <w:t xml:space="preserve"> / </w:t>
+              <w:t xml:space="preserve">Contratado / </w:t>
             </w:r>
             <w:proofErr w:type="spellStart"/>
             <w:r>
@@ -224,7 +215,7 @@
                 <w:sz w:val="24"/>
                 <w:szCs w:val="24"/>
               </w:rPr>
-              <w:t>Adimael Santos da Silva</w:t>
+              <w:t>HS TECNOLOGIA LTDA</w:t>
             </w:r>
           </w:p>
         </w:tc>
@@ -246,21 +237,12 @@
                 <w:szCs w:val="24"/>
               </w:rPr>
             </w:pPr>
-            <w:proofErr w:type="spellStart"/>
             <w:r>
               <w:rPr>
                 <w:sz w:val="24"/>
                 <w:szCs w:val="24"/>
               </w:rPr>
-              <w:t>Início</w:t>
-            </w:r>
-            <w:proofErr w:type="spellEnd"/>
-            <w:r>
-              <w:rPr>
-                <w:sz w:val="24"/>
-                <w:szCs w:val="24"/>
-              </w:rPr>
-              <w:t xml:space="preserve"> </w:t>
+              <w:t xml:space="preserve">Início </w:t>
             </w:r>
             <w:proofErr w:type="spellStart"/>
             <w:r>
@@ -433,8 +415,17 @@
       <w:pPr>
         <w:pStyle w:val="Ttulo1"/>
       </w:pPr>
+    </w:p>
+    <w:p>
+      <w:pPr>
+        <w:pStyle w:val="Ttulo1"/>
+      </w:pPr>
+    </w:p>
+    <w:p>
+      <w:pPr>
+        <w:pStyle w:val="Ttulo1"/>
+      </w:pPr>
       <w:r>
-        <w:lastRenderedPageBreak/>
         <w:t>1. Apresentação da proposta</w:t>
       </w:r>
     </w:p>
@@ -469,16 +460,7 @@
           <w:color w:val="FE3000"/>
           <w:sz w:val="21"/>
         </w:rPr>
-        <w:t xml:space="preserve">RESUMO </w:t>
-      </w:r>
-      <w:proofErr w:type="gramStart"/>
-      <w:r>
-        <w:rPr>
-          <w:b/>
-          <w:color w:val="FE3000"/>
-          <w:sz w:val="21"/>
-        </w:rPr>
-        <w:t xml:space="preserve">EXECUTIVO  </w:t>
+        <w:t xml:space="preserve">RESUMO EXECUTIVO  </w:t>
       </w:r>
       <w:proofErr w:type="spellStart"/>
       <w:r>
@@ -488,7 +470,6 @@
         <w:t>Prazo</w:t>
       </w:r>
       <w:proofErr w:type="spellEnd"/>
-      <w:proofErr w:type="gramEnd"/>
       <w:r>
         <w:rPr>
           <w:sz w:val="21"/>
@@ -571,15 +552,7 @@
         <w:ind w:left="540" w:hanging="279"/>
       </w:pPr>
       <w:r>
-        <w:t xml:space="preserve">Preparar a aplicação para implantação em Ubuntu Server com Docker Compose e </w:t>
-      </w:r>
-      <w:proofErr w:type="spellStart"/>
-      <w:r>
-        <w:t>configuração</w:t>
-      </w:r>
-      <w:proofErr w:type="spellEnd"/>
-      <w:r>
-        <w:t xml:space="preserve"> </w:t>
+        <w:t xml:space="preserve">Preparar a aplicação para implantação em Ubuntu Server com Docker Compose e configuração </w:t>
       </w:r>
       <w:proofErr w:type="spellStart"/>
       <w:r>
@@ -603,16 +576,101 @@
       </w:r>
       <w:proofErr w:type="spellEnd"/>
       <w:r>
-        <w:t xml:space="preserve"> de </w:t>
+        <w:t xml:space="preserve"> de ambiente.</w:t>
       </w:r>
-      <w:proofErr w:type="spellStart"/>
-      <w:r>
-        <w:t>ambiente</w:t>
-      </w:r>
-      <w:proofErr w:type="spellEnd"/>
-      <w:r>
-        <w:t>.</w:t>
-      </w:r>
+    </w:p>
+    <w:p>
+      <w:pPr>
+        <w:pStyle w:val="Commarcadores"/>
+        <w:numPr>
+          <w:ilvl w:val="0"/>
+          <w:numId w:val="0"/>
+        </w:numPr>
+        <w:spacing w:after="80" w:line="290" w:lineRule="auto"/>
+        <w:ind w:left="360" w:hanging="360"/>
+      </w:pPr>
+    </w:p>
+    <w:p>
+      <w:pPr>
+        <w:pStyle w:val="Commarcadores"/>
+        <w:numPr>
+          <w:ilvl w:val="0"/>
+          <w:numId w:val="0"/>
+        </w:numPr>
+        <w:spacing w:after="80" w:line="290" w:lineRule="auto"/>
+        <w:ind w:left="360" w:hanging="360"/>
+      </w:pPr>
+    </w:p>
+    <w:p>
+      <w:pPr>
+        <w:pStyle w:val="Commarcadores"/>
+        <w:numPr>
+          <w:ilvl w:val="0"/>
+          <w:numId w:val="0"/>
+        </w:numPr>
+        <w:spacing w:after="80" w:line="290" w:lineRule="auto"/>
+        <w:ind w:left="360" w:hanging="360"/>
+      </w:pPr>
+    </w:p>
+    <w:p>
+      <w:pPr>
+        <w:pStyle w:val="Commarcadores"/>
+        <w:numPr>
+          <w:ilvl w:val="0"/>
+          <w:numId w:val="0"/>
+        </w:numPr>
+        <w:spacing w:after="80" w:line="290" w:lineRule="auto"/>
+        <w:ind w:left="360" w:hanging="360"/>
+      </w:pPr>
+    </w:p>
+    <w:p>
+      <w:pPr>
+        <w:pStyle w:val="Commarcadores"/>
+        <w:numPr>
+          <w:ilvl w:val="0"/>
+          <w:numId w:val="0"/>
+        </w:numPr>
+        <w:spacing w:after="80" w:line="290" w:lineRule="auto"/>
+        <w:ind w:left="360" w:hanging="360"/>
+      </w:pPr>
+    </w:p>
+    <w:p>
+      <w:pPr>
+        <w:pStyle w:val="Commarcadores"/>
+        <w:numPr>
+          <w:ilvl w:val="0"/>
+          <w:numId w:val="0"/>
+        </w:numPr>
+        <w:spacing w:after="80" w:line="290" w:lineRule="auto"/>
+        <w:ind w:left="360" w:hanging="360"/>
+      </w:pPr>
+    </w:p>
+    <w:p>
+      <w:pPr>
+        <w:pStyle w:val="Commarcadores"/>
+        <w:numPr>
+          <w:ilvl w:val="0"/>
+          <w:numId w:val="0"/>
+        </w:numPr>
+        <w:spacing w:after="80" w:line="290" w:lineRule="auto"/>
+        <w:ind w:left="360" w:hanging="360"/>
+      </w:pPr>
+    </w:p>
+    <w:p>
+      <w:pPr>
+        <w:pStyle w:val="Commarcadores"/>
+        <w:numPr>
+          <w:ilvl w:val="0"/>
+          <w:numId w:val="0"/>
+        </w:numPr>
+        <w:spacing w:after="80" w:line="290" w:lineRule="auto"/>
+        <w:ind w:left="360" w:hanging="360"/>
+      </w:pPr>
+    </w:p>
+    <w:p>
+      <w:pPr>
+        <w:pStyle w:val="Ttulo1"/>
+      </w:pPr>
     </w:p>
     <w:p>
       <w:pPr>
@@ -677,6 +735,9 @@
         </w:tc>
       </w:tr>
       <w:tr>
+        <w:trPr>
+          <w:trHeight w:val="836"/>
+        </w:trPr>
         <w:tc>
           <w:tcPr>
             <w:cnfStyle w:val="001000000000" w:firstRow="0" w:lastRow="0" w:firstColumn="1" w:lastColumn="0" w:oddVBand="0" w:evenVBand="0" w:oddHBand="0" w:evenHBand="0" w:firstRowFirstColumn="0" w:firstRowLastColumn="0" w:lastRowFirstColumn="0" w:lastRowLastColumn="0"/>
@@ -723,6 +784,9 @@
         </w:tc>
       </w:tr>
       <w:tr>
+        <w:trPr>
+          <w:trHeight w:val="699"/>
+        </w:trPr>
         <w:tc>
           <w:tcPr>
             <w:cnfStyle w:val="001000000000" w:firstRow="0" w:lastRow="0" w:firstColumn="1" w:lastColumn="0" w:oddVBand="0" w:evenVBand="0" w:oddHBand="0" w:evenHBand="0" w:firstRowFirstColumn="0" w:firstRowLastColumn="0" w:lastRowFirstColumn="0" w:lastRowLastColumn="0"/>
@@ -769,6 +833,9 @@
         </w:tc>
       </w:tr>
       <w:tr>
+        <w:trPr>
+          <w:trHeight w:val="694"/>
+        </w:trPr>
         <w:tc>
           <w:tcPr>
             <w:cnfStyle w:val="001000000000" w:firstRow="0" w:lastRow="0" w:firstColumn="1" w:lastColumn="0" w:oddVBand="0" w:evenVBand="0" w:oddHBand="0" w:evenHBand="0" w:firstRowFirstColumn="0" w:firstRowLastColumn="0" w:lastRowFirstColumn="0" w:lastRowLastColumn="0"/>
@@ -815,6 +882,9 @@
         </w:tc>
       </w:tr>
       <w:tr>
+        <w:trPr>
+          <w:trHeight w:val="704"/>
+        </w:trPr>
         <w:tc>
           <w:tcPr>
             <w:cnfStyle w:val="001000000000" w:firstRow="0" w:lastRow="0" w:firstColumn="1" w:lastColumn="0" w:oddVBand="0" w:evenVBand="0" w:oddHBand="0" w:evenHBand="0" w:firstRowFirstColumn="0" w:firstRowLastColumn="0" w:lastRowFirstColumn="0" w:lastRowLastColumn="0"/>
@@ -925,7 +995,15 @@
                 <w:sz w:val="24"/>
                 <w:szCs w:val="24"/>
               </w:rPr>
-              <w:t>Métricas</w:t>
+              <w:t xml:space="preserve">Integração com o </w:t>
+            </w:r>
+            <w:r>
+              <w:rPr>
+                <w:rFonts w:ascii="Montserrat" w:hAnsi="Montserrat"/>
+                <w:sz w:val="20"/>
+                <w:szCs w:val="20"/>
+              </w:rPr>
+              <w:t>Google Analytics</w:t>
             </w:r>
           </w:p>
         </w:tc>
@@ -935,19 +1013,23 @@
           </w:tcPr>
           <w:p>
             <w:pPr>
-              <w:spacing w:after="0" w:line="252" w:lineRule="auto"/>
+              <w:spacing w:after="0" w:line="259" w:lineRule="auto"/>
+              <w:ind w:right="112"/>
+              <w:jc w:val="both"/>
               <w:cnfStyle w:val="000000000000" w:firstRow="0" w:lastRow="0" w:firstColumn="0" w:lastColumn="0" w:oddVBand="0" w:evenVBand="0" w:oddHBand="0" w:evenHBand="0" w:firstRowFirstColumn="0" w:firstRowLastColumn="0" w:lastRowFirstColumn="0" w:lastRowLastColumn="0"/>
               <w:rPr>
-                <w:sz w:val="24"/>
-                <w:szCs w:val="24"/>
+                <w:rFonts w:ascii="Montserrat" w:hAnsi="Montserrat"/>
+                <w:sz w:val="20"/>
+                <w:szCs w:val="20"/>
               </w:rPr>
             </w:pPr>
             <w:r>
               <w:rPr>
-                <w:sz w:val="24"/>
-                <w:szCs w:val="24"/>
-              </w:rPr>
-              <w:t>Visualizações, buscas, recortes por período, publicações mais acessadas e filtros para reduzir falsos positivos.</w:t>
+                <w:rFonts w:ascii="Montserrat" w:hAnsi="Montserrat"/>
+                <w:sz w:val="20"/>
+                <w:szCs w:val="20"/>
+              </w:rPr>
+              <w:t>Implementação e configuração do Google Analytics no portal;</w:t>
             </w:r>
           </w:p>
         </w:tc>
@@ -964,14 +1046,204 @@
               <w:rPr>
                 <w:sz w:val="24"/>
                 <w:szCs w:val="24"/>
+                <w:u w:val="single"/>
               </w:rPr>
             </w:pPr>
             <w:r>
               <w:rPr>
-                <w:sz w:val="24"/>
-                <w:szCs w:val="24"/>
-              </w:rPr>
-              <w:lastRenderedPageBreak/>
+                <w:rFonts w:ascii="Montserrat" w:hAnsi="Montserrat"/>
+                <w:sz w:val="20"/>
+                <w:szCs w:val="20"/>
+              </w:rPr>
+              <w:t>OpenTelemetry</w:t>
+            </w:r>
+          </w:p>
+        </w:tc>
+        <w:tc>
+          <w:tcPr>
+            <w:tcW w:w="8114" w:type="dxa"/>
+          </w:tcPr>
+          <w:p>
+            <w:pPr>
+              <w:spacing w:after="0" w:line="259" w:lineRule="auto"/>
+              <w:ind w:right="112"/>
+              <w:jc w:val="both"/>
+              <w:cnfStyle w:val="000000000000" w:firstRow="0" w:lastRow="0" w:firstColumn="0" w:lastColumn="0" w:oddVBand="0" w:evenVBand="0" w:oddHBand="0" w:evenHBand="0" w:firstRowFirstColumn="0" w:firstRowLastColumn="0" w:lastRowFirstColumn="0" w:lastRowLastColumn="0"/>
+              <w:rPr>
+                <w:rFonts w:ascii="Montserrat" w:hAnsi="Montserrat"/>
+                <w:sz w:val="20"/>
+                <w:szCs w:val="20"/>
+              </w:rPr>
+            </w:pPr>
+            <w:r>
+              <w:rPr>
+                <w:rFonts w:ascii="Montserrat" w:hAnsi="Montserrat"/>
+                <w:sz w:val="20"/>
+                <w:szCs w:val="20"/>
+              </w:rPr>
+              <w:t>Implementação e configuração da integração necessária para exportação de logs no padrão OpenTelemet</w:t>
+            </w:r>
+            <w:r>
+              <w:rPr>
+                <w:rFonts w:ascii="Montserrat" w:hAnsi="Montserrat"/>
+                <w:sz w:val="20"/>
+                <w:szCs w:val="20"/>
+              </w:rPr>
+              <w:t>r</w:t>
+            </w:r>
+            <w:r>
+              <w:rPr>
+                <w:rFonts w:ascii="Montserrat" w:hAnsi="Montserrat"/>
+                <w:sz w:val="20"/>
+                <w:szCs w:val="20"/>
+              </w:rPr>
+              <w:t>y;</w:t>
+            </w:r>
+          </w:p>
+          <w:p>
+            <w:pPr>
+              <w:spacing w:after="0" w:line="259" w:lineRule="auto"/>
+              <w:ind w:right="112"/>
+              <w:jc w:val="both"/>
+              <w:cnfStyle w:val="000000000000" w:firstRow="0" w:lastRow="0" w:firstColumn="0" w:lastColumn="0" w:oddVBand="0" w:evenVBand="0" w:oddHBand="0" w:evenHBand="0" w:firstRowFirstColumn="0" w:firstRowLastColumn="0" w:lastRowFirstColumn="0" w:lastRowLastColumn="0"/>
+              <w:rPr>
+                <w:rFonts w:ascii="Montserrat" w:hAnsi="Montserrat"/>
+                <w:sz w:val="20"/>
+                <w:szCs w:val="20"/>
+              </w:rPr>
+            </w:pPr>
+          </w:p>
+        </w:tc>
+      </w:tr>
+      <w:tr>
+        <w:tc>
+          <w:tcPr>
+            <w:cnfStyle w:val="001000000000" w:firstRow="0" w:lastRow="0" w:firstColumn="1" w:lastColumn="0" w:oddVBand="0" w:evenVBand="0" w:oddHBand="0" w:evenHBand="0" w:firstRowFirstColumn="0" w:firstRowLastColumn="0" w:lastRowFirstColumn="0" w:lastRowLastColumn="0"/>
+            <w:tcW w:w="2200" w:type="dxa"/>
+          </w:tcPr>
+          <w:p>
+            <w:pPr>
+              <w:spacing w:after="0" w:line="252" w:lineRule="auto"/>
+              <w:rPr>
+                <w:sz w:val="24"/>
+                <w:szCs w:val="24"/>
+              </w:rPr>
+            </w:pPr>
+            <w:r>
+              <w:rPr>
+                <w:sz w:val="24"/>
+                <w:szCs w:val="24"/>
+              </w:rPr>
+              <w:t>Métricas</w:t>
+            </w:r>
+          </w:p>
+        </w:tc>
+        <w:tc>
+          <w:tcPr>
+            <w:tcW w:w="8114" w:type="dxa"/>
+          </w:tcPr>
+          <w:p>
+            <w:pPr>
+              <w:spacing w:after="0" w:line="252" w:lineRule="auto"/>
+              <w:cnfStyle w:val="000000000000" w:firstRow="0" w:lastRow="0" w:firstColumn="0" w:lastColumn="0" w:oddVBand="0" w:evenVBand="0" w:oddHBand="0" w:evenHBand="0" w:firstRowFirstColumn="0" w:firstRowLastColumn="0" w:lastRowFirstColumn="0" w:lastRowLastColumn="0"/>
+              <w:rPr>
+                <w:sz w:val="24"/>
+                <w:szCs w:val="24"/>
+              </w:rPr>
+            </w:pPr>
+            <w:r>
+              <w:rPr>
+                <w:sz w:val="24"/>
+                <w:szCs w:val="24"/>
+              </w:rPr>
+              <w:t>Visualizações, buscas, recortes por período, publicações mais acessadas e filtros para reduzir falsos positivos.</w:t>
+            </w:r>
+          </w:p>
+        </w:tc>
+      </w:tr>
+      <w:tr>
+        <w:trPr>
+          <w:trHeight w:val="535"/>
+        </w:trPr>
+        <w:tc>
+          <w:tcPr>
+            <w:cnfStyle w:val="001000000000" w:firstRow="0" w:lastRow="0" w:firstColumn="1" w:lastColumn="0" w:oddVBand="0" w:evenVBand="0" w:oddHBand="0" w:evenHBand="0" w:firstRowFirstColumn="0" w:firstRowLastColumn="0" w:lastRowFirstColumn="0" w:lastRowLastColumn="0"/>
+            <w:tcW w:w="2200" w:type="dxa"/>
+          </w:tcPr>
+          <w:p>
+            <w:pPr>
+              <w:spacing w:after="0" w:line="252" w:lineRule="auto"/>
+              <w:rPr>
+                <w:sz w:val="24"/>
+                <w:szCs w:val="24"/>
+              </w:rPr>
+            </w:pPr>
+            <w:r>
+              <w:rPr>
+                <w:rFonts w:ascii="Montserrat" w:hAnsi="Montserrat"/>
+                <w:sz w:val="20"/>
+                <w:szCs w:val="20"/>
+              </w:rPr>
+              <w:t>Política de Privacidade e Consentimento</w:t>
+            </w:r>
+          </w:p>
+        </w:tc>
+        <w:tc>
+          <w:tcPr>
+            <w:tcW w:w="8114" w:type="dxa"/>
+          </w:tcPr>
+          <w:p>
+            <w:pPr>
+              <w:spacing w:after="0" w:line="259" w:lineRule="auto"/>
+              <w:ind w:right="112"/>
+              <w:jc w:val="both"/>
+              <w:cnfStyle w:val="000000000000" w:firstRow="0" w:lastRow="0" w:firstColumn="0" w:lastColumn="0" w:oddVBand="0" w:evenVBand="0" w:oddHBand="0" w:evenHBand="0" w:firstRowFirstColumn="0" w:firstRowLastColumn="0" w:lastRowFirstColumn="0" w:lastRowLastColumn="0"/>
+              <w:rPr>
+                <w:rFonts w:ascii="Montserrat" w:hAnsi="Montserrat"/>
+                <w:sz w:val="20"/>
+                <w:szCs w:val="20"/>
+              </w:rPr>
+            </w:pPr>
+            <w:r>
+              <w:rPr>
+                <w:rFonts w:ascii="Montserrat" w:hAnsi="Montserrat"/>
+                <w:sz w:val="20"/>
+                <w:szCs w:val="20"/>
+              </w:rPr>
+              <w:t>Implementação de página destinada à política de dados/privacidade;</w:t>
+            </w:r>
+          </w:p>
+          <w:p>
+            <w:pPr>
+              <w:spacing w:after="0" w:line="252" w:lineRule="auto"/>
+              <w:cnfStyle w:val="000000000000" w:firstRow="0" w:lastRow="0" w:firstColumn="0" w:lastColumn="0" w:oddVBand="0" w:evenVBand="0" w:oddHBand="0" w:evenHBand="0" w:firstRowFirstColumn="0" w:firstRowLastColumn="0" w:lastRowFirstColumn="0" w:lastRowLastColumn="0"/>
+              <w:rPr>
+                <w:sz w:val="24"/>
+                <w:szCs w:val="24"/>
+              </w:rPr>
+            </w:pPr>
+          </w:p>
+        </w:tc>
+      </w:tr>
+      <w:tr>
+        <w:tc>
+          <w:tcPr>
+            <w:cnfStyle w:val="001000000000" w:firstRow="0" w:lastRow="0" w:firstColumn="1" w:lastColumn="0" w:oddVBand="0" w:evenVBand="0" w:oddHBand="0" w:evenHBand="0" w:firstRowFirstColumn="0" w:firstRowLastColumn="0" w:lastRowFirstColumn="0" w:lastRowLastColumn="0"/>
+            <w:tcW w:w="2200" w:type="dxa"/>
+          </w:tcPr>
+          <w:p>
+            <w:pPr>
+              <w:spacing w:after="0" w:line="252" w:lineRule="auto"/>
+              <w:rPr>
+                <w:sz w:val="24"/>
+                <w:szCs w:val="24"/>
+              </w:rPr>
+            </w:pPr>
+            <w:r>
+              <w:rPr>
+                <w:sz w:val="24"/>
+                <w:szCs w:val="24"/>
+              </w:rPr>
               <w:t>Newsletter</w:t>
             </w:r>
           </w:p>
@@ -1015,6 +1287,73 @@
             </w:pPr>
             <w:r>
               <w:rPr>
+                <w:rFonts w:ascii="Montserrat" w:hAnsi="Montserrat"/>
+                <w:sz w:val="20"/>
+                <w:szCs w:val="20"/>
+              </w:rPr>
+              <w:t>Armazenamento</w:t>
+            </w:r>
+          </w:p>
+        </w:tc>
+        <w:tc>
+          <w:tcPr>
+            <w:tcW w:w="8114" w:type="dxa"/>
+          </w:tcPr>
+          <w:p>
+            <w:pPr>
+              <w:spacing w:after="0" w:line="259" w:lineRule="auto"/>
+              <w:ind w:right="112"/>
+              <w:jc w:val="both"/>
+              <w:cnfStyle w:val="000000000000" w:firstRow="0" w:lastRow="0" w:firstColumn="0" w:lastColumn="0" w:oddVBand="0" w:evenVBand="0" w:oddHBand="0" w:evenHBand="0" w:firstRowFirstColumn="0" w:firstRowLastColumn="0" w:lastRowFirstColumn="0" w:lastRowLastColumn="0"/>
+              <w:rPr>
+                <w:rFonts w:ascii="Montserrat" w:hAnsi="Montserrat"/>
+                <w:sz w:val="20"/>
+                <w:szCs w:val="20"/>
+              </w:rPr>
+            </w:pPr>
+            <w:r>
+              <w:rPr>
+                <w:rFonts w:ascii="Montserrat" w:hAnsi="Montserrat"/>
+                <w:sz w:val="20"/>
+                <w:szCs w:val="20"/>
+              </w:rPr>
+              <w:t>Implementação</w:t>
+            </w:r>
+            <w:r>
+              <w:rPr>
+                <w:rFonts w:ascii="Montserrat" w:hAnsi="Montserrat"/>
+                <w:sz w:val="20"/>
+                <w:szCs w:val="20"/>
+              </w:rPr>
+              <w:t xml:space="preserve"> </w:t>
+            </w:r>
+            <w:r>
+              <w:rPr>
+                <w:rFonts w:ascii="Montserrat" w:hAnsi="Montserrat"/>
+                <w:sz w:val="20"/>
+                <w:szCs w:val="20"/>
+              </w:rPr>
+              <w:t>para utilização de armazenamento externo compatível com serviços de armazenamento em nuvem, incluindo AWS S3 ou serviço equivalente;</w:t>
+            </w:r>
+          </w:p>
+        </w:tc>
+      </w:tr>
+      <w:tr>
+        <w:tc>
+          <w:tcPr>
+            <w:cnfStyle w:val="001000000000" w:firstRow="0" w:lastRow="0" w:firstColumn="1" w:lastColumn="0" w:oddVBand="0" w:evenVBand="0" w:oddHBand="0" w:evenHBand="0" w:firstRowFirstColumn="0" w:firstRowLastColumn="0" w:lastRowFirstColumn="0" w:lastRowLastColumn="0"/>
+            <w:tcW w:w="2200" w:type="dxa"/>
+          </w:tcPr>
+          <w:p>
+            <w:pPr>
+              <w:spacing w:after="0" w:line="252" w:lineRule="auto"/>
+              <w:rPr>
+                <w:sz w:val="24"/>
+                <w:szCs w:val="24"/>
+              </w:rPr>
+            </w:pPr>
+            <w:r>
+              <w:rPr>
                 <w:sz w:val="24"/>
                 <w:szCs w:val="24"/>
               </w:rPr>
@@ -1042,21 +1381,19 @@
               </w:rPr>
               <w:t>Docker Compose com PostgreSQL, migrations, seed inicial</w:t>
             </w:r>
-            <w:proofErr w:type="gramStart"/>
             <w:r>
               <w:rPr>
                 <w:sz w:val="24"/>
                 <w:szCs w:val="24"/>
               </w:rPr>
-              <w:t>, .env</w:t>
+              <w:t xml:space="preserve"> </w:t>
             </w:r>
-            <w:proofErr w:type="gramEnd"/>
             <w:r>
               <w:rPr>
                 <w:sz w:val="24"/>
                 <w:szCs w:val="24"/>
               </w:rPr>
-              <w:t>, documentação e roteiro de instalação em Ubuntu Server.</w:t>
+              <w:t>.env, documentação e roteiro de instalação em Ubuntu Server.</w:t>
             </w:r>
           </w:p>
         </w:tc>
@@ -1080,8 +1417,55 @@
         <w:jc w:val="both"/>
       </w:pPr>
       <w:r>
-        <w:t>A aplicação adotará uma arquitetura integrada de frontend e backend no mesmo repositório, com módulos separados por responsabilidade. Essa decisão simplifica implantação, versionamento, configuração e manutenção do MVP, sem impedir a separação física dos serviços caso o volume ou a operação futura exijam escalabilidade independente.</w:t>
+        <w:t xml:space="preserve">A aplicação adotará uma arquitetura integrada de frontend e backend no mesmo repositório, com módulos separados por responsabilidade. Essa decisão simplifica implantação, versionamento, configuração e manutenção do MVP, sem impedir a separação física dos serviços caso o volume ou a operação </w:t>
       </w:r>
+      <w:proofErr w:type="spellStart"/>
+      <w:r>
+        <w:t>futura</w:t>
+      </w:r>
+      <w:proofErr w:type="spellEnd"/>
+      <w:r>
+        <w:t xml:space="preserve"> </w:t>
+      </w:r>
+      <w:proofErr w:type="spellStart"/>
+      <w:r>
+        <w:t>exijam</w:t>
+      </w:r>
+      <w:proofErr w:type="spellEnd"/>
+      <w:r>
+        <w:t xml:space="preserve"> </w:t>
+      </w:r>
+      <w:proofErr w:type="spellStart"/>
+      <w:r>
+        <w:t>escalabilidade</w:t>
+      </w:r>
+      <w:proofErr w:type="spellEnd"/>
+      <w:r>
+        <w:t xml:space="preserve"> </w:t>
+      </w:r>
+      <w:proofErr w:type="spellStart"/>
+      <w:r>
+        <w:t>independente</w:t>
+      </w:r>
+      <w:proofErr w:type="spellEnd"/>
+      <w:r>
+        <w:t>.</w:t>
+      </w:r>
+    </w:p>
+    <w:p>
+      <w:pPr>
+        <w:jc w:val="both"/>
+      </w:pPr>
+    </w:p>
+    <w:p>
+      <w:pPr>
+        <w:jc w:val="both"/>
+      </w:pPr>
+    </w:p>
+    <w:p>
+      <w:pPr>
+        <w:jc w:val="both"/>
+      </w:pPr>
     </w:p>
     <w:tbl>
       <w:tblPr>
@@ -1531,7 +1915,23 @@
         <w:ind w:left="540" w:hanging="279"/>
       </w:pPr>
       <w:r>
-        <w:t>Aplicação testada, homologada com a contratante e implantada no ambiente disponibilizado.</w:t>
+        <w:t xml:space="preserve">Aplicação testada, homologada com a contratante e </w:t>
+      </w:r>
+      <w:proofErr w:type="spellStart"/>
+      <w:r>
+        <w:t>implantada</w:t>
+      </w:r>
+      <w:proofErr w:type="spellEnd"/>
+      <w:r>
+        <w:t xml:space="preserve"> no ambiente </w:t>
+      </w:r>
+      <w:proofErr w:type="spellStart"/>
+      <w:r>
+        <w:t>disponibilizado</w:t>
+      </w:r>
+      <w:proofErr w:type="spellEnd"/>
+      <w:r>
+        <w:t>.</w:t>
       </w:r>
     </w:p>
     <w:p>
@@ -1539,7 +1939,6 @@
         <w:pStyle w:val="Ttulo1"/>
       </w:pPr>
       <w:r>
-        <w:lastRenderedPageBreak/>
         <w:t>6. Cronograma de execução</w:t>
       </w:r>
     </w:p>
@@ -1551,18 +1950,27 @@
         <w:t>Prazo estimado de até 45 dias corridos. Considerando a aprovação da proposta e o recebimento dos acessos e materiais necessários, o início está previsto para 13 de agosto de 2026 e a entrega final para até 26 de setembro de 2026.</w:t>
       </w:r>
     </w:p>
+    <w:p>
+      <w:pPr>
+        <w:jc w:val="both"/>
+      </w:pPr>
+    </w:p>
+    <w:p>
+      <w:pPr>
+        <w:jc w:val="both"/>
+      </w:pPr>
+    </w:p>
     <w:tbl>
       <w:tblPr>
         <w:tblStyle w:val="TabeladeGrade1Clara-nfase6"/>
-        <w:tblW w:w="10456" w:type="dxa"/>
+        <w:tblW w:w="10598" w:type="dxa"/>
         <w:tblLayout w:type="fixed"/>
         <w:tblLook w:val="04A0" w:firstRow="1" w:lastRow="0" w:firstColumn="1" w:lastColumn="0" w:noHBand="0" w:noVBand="1"/>
       </w:tblPr>
       <w:tblGrid>
-        <w:gridCol w:w="959"/>
-        <w:gridCol w:w="1276"/>
-        <w:gridCol w:w="1815"/>
-        <w:gridCol w:w="6406"/>
+        <w:gridCol w:w="2235"/>
+        <w:gridCol w:w="5811"/>
+        <w:gridCol w:w="2552"/>
       </w:tblGrid>
       <w:tr>
         <w:trPr>
@@ -1571,7 +1979,7 @@
         <w:tc>
           <w:tcPr>
             <w:cnfStyle w:val="001000000000" w:firstRow="0" w:lastRow="0" w:firstColumn="1" w:lastColumn="0" w:oddVBand="0" w:evenVBand="0" w:oddHBand="0" w:evenHBand="0" w:firstRowFirstColumn="0" w:firstRowLastColumn="0" w:lastRowFirstColumn="0" w:lastRowLastColumn="0"/>
-            <w:tcW w:w="959" w:type="dxa"/>
+            <w:tcW w:w="2235" w:type="dxa"/>
             <w:shd w:val="clear" w:color="auto" w:fill="EE0000"/>
           </w:tcPr>
           <w:p>
@@ -1588,13 +1996,14 @@
                 <w:sz w:val="24"/>
                 <w:szCs w:val="24"/>
               </w:rPr>
+              <w:lastRenderedPageBreak/>
               <w:t>ETAPA</w:t>
             </w:r>
           </w:p>
         </w:tc>
         <w:tc>
           <w:tcPr>
-            <w:tcW w:w="1276" w:type="dxa"/>
+            <w:tcW w:w="5811" w:type="dxa"/>
             <w:shd w:val="clear" w:color="auto" w:fill="EE0000"/>
           </w:tcPr>
           <w:p>
@@ -1612,13 +2021,13 @@
                 <w:sz w:val="24"/>
                 <w:szCs w:val="24"/>
               </w:rPr>
-              <w:t>PERÍODO</w:t>
+              <w:t>ATIVIDADE</w:t>
             </w:r>
           </w:p>
         </w:tc>
         <w:tc>
           <w:tcPr>
-            <w:tcW w:w="1815" w:type="dxa"/>
+            <w:tcW w:w="2552" w:type="dxa"/>
             <w:shd w:val="clear" w:color="auto" w:fill="EE0000"/>
           </w:tcPr>
           <w:p>
@@ -1636,31 +2045,7 @@
                 <w:sz w:val="24"/>
                 <w:szCs w:val="24"/>
               </w:rPr>
-              <w:t>ATIVIDADE</w:t>
-            </w:r>
-          </w:p>
-        </w:tc>
-        <w:tc>
-          <w:tcPr>
-            <w:tcW w:w="6406" w:type="dxa"/>
-            <w:shd w:val="clear" w:color="auto" w:fill="EE0000"/>
-          </w:tcPr>
-          <w:p>
-            <w:pPr>
-              <w:spacing w:after="0"/>
-              <w:cnfStyle w:val="100000000000" w:firstRow="1" w:lastRow="0" w:firstColumn="0" w:lastColumn="0" w:oddVBand="0" w:evenVBand="0" w:oddHBand="0" w:evenHBand="0" w:firstRowFirstColumn="0" w:firstRowLastColumn="0" w:lastRowFirstColumn="0" w:lastRowLastColumn="0"/>
-              <w:rPr>
-                <w:sz w:val="24"/>
-                <w:szCs w:val="24"/>
-              </w:rPr>
-            </w:pPr>
-            <w:r>
-              <w:rPr>
-                <w:color w:val="FFFFFF"/>
-                <w:sz w:val="24"/>
-                <w:szCs w:val="24"/>
-              </w:rPr>
-              <w:t>RESULTADO ESPERADO</w:t>
+              <w:t>PRAZO ESTIMADO</w:t>
             </w:r>
           </w:p>
         </w:tc>
@@ -1669,7 +2054,7 @@
         <w:tc>
           <w:tcPr>
             <w:cnfStyle w:val="001000000000" w:firstRow="0" w:lastRow="0" w:firstColumn="1" w:lastColumn="0" w:oddVBand="0" w:evenVBand="0" w:oddHBand="0" w:evenHBand="0" w:firstRowFirstColumn="0" w:firstRowLastColumn="0" w:lastRowFirstColumn="0" w:lastRowLastColumn="0"/>
-            <w:tcW w:w="959" w:type="dxa"/>
+            <w:tcW w:w="2235" w:type="dxa"/>
           </w:tcPr>
           <w:p>
             <w:pPr>
@@ -1684,13 +2069,13 @@
                 <w:sz w:val="24"/>
                 <w:szCs w:val="24"/>
               </w:rPr>
-              <w:t>1</w:t>
+              <w:t>1. Preparação e configuração inicial</w:t>
             </w:r>
           </w:p>
         </w:tc>
         <w:tc>
           <w:tcPr>
-            <w:tcW w:w="1276" w:type="dxa"/>
+            <w:tcW w:w="5811" w:type="dxa"/>
           </w:tcPr>
           <w:p>
             <w:pPr>
@@ -1706,13 +2091,13 @@
                 <w:sz w:val="24"/>
                 <w:szCs w:val="24"/>
               </w:rPr>
-              <w:t>13 a 19/08</w:t>
+              <w:t>Preparação do ambiente, organização dos acessos e configurações necessárias para o desenvolvimento e implantação do projeto.</w:t>
             </w:r>
           </w:p>
         </w:tc>
         <w:tc>
           <w:tcPr>
-            <w:tcW w:w="1815" w:type="dxa"/>
+            <w:tcW w:w="2552" w:type="dxa"/>
           </w:tcPr>
           <w:p>
             <w:pPr>
@@ -1728,127 +2113,7 @@
                 <w:sz w:val="24"/>
                 <w:szCs w:val="24"/>
               </w:rPr>
-              <w:t xml:space="preserve">Modelo e </w:t>
-            </w:r>
-            <w:proofErr w:type="spellStart"/>
-            <w:r>
-              <w:rPr>
-                <w:sz w:val="24"/>
-                <w:szCs w:val="24"/>
-              </w:rPr>
-              <w:t>validação</w:t>
-            </w:r>
-            <w:proofErr w:type="spellEnd"/>
-          </w:p>
-        </w:tc>
-        <w:tc>
-          <w:tcPr>
-            <w:tcW w:w="6406" w:type="dxa"/>
-          </w:tcPr>
-          <w:p>
-            <w:pPr>
-              <w:spacing w:after="0" w:line="252" w:lineRule="auto"/>
-              <w:cnfStyle w:val="000000000000" w:firstRow="0" w:lastRow="0" w:firstColumn="0" w:lastColumn="0" w:oddVBand="0" w:evenVBand="0" w:oddHBand="0" w:evenHBand="0" w:firstRowFirstColumn="0" w:firstRowLastColumn="0" w:lastRowFirstColumn="0" w:lastRowLastColumn="0"/>
-              <w:rPr>
-                <w:sz w:val="24"/>
-                <w:szCs w:val="24"/>
-              </w:rPr>
-            </w:pPr>
-            <w:proofErr w:type="spellStart"/>
-            <w:r>
-              <w:rPr>
-                <w:sz w:val="24"/>
-                <w:szCs w:val="24"/>
-              </w:rPr>
-              <w:t>Protótipo</w:t>
-            </w:r>
-            <w:proofErr w:type="spellEnd"/>
-            <w:r>
-              <w:rPr>
-                <w:sz w:val="24"/>
-                <w:szCs w:val="24"/>
-              </w:rPr>
-              <w:t xml:space="preserve">, </w:t>
-            </w:r>
-            <w:proofErr w:type="spellStart"/>
-            <w:r>
-              <w:rPr>
-                <w:sz w:val="24"/>
-                <w:szCs w:val="24"/>
-              </w:rPr>
-              <w:t>requisitos</w:t>
-            </w:r>
-            <w:proofErr w:type="spellEnd"/>
-            <w:r>
-              <w:rPr>
-                <w:sz w:val="24"/>
-                <w:szCs w:val="24"/>
-              </w:rPr>
-              <w:t xml:space="preserve"> e </w:t>
-            </w:r>
-            <w:proofErr w:type="spellStart"/>
-            <w:r>
-              <w:rPr>
-                <w:sz w:val="24"/>
-                <w:szCs w:val="24"/>
-              </w:rPr>
-              <w:t>escopo</w:t>
-            </w:r>
-            <w:proofErr w:type="spellEnd"/>
-            <w:r>
-              <w:rPr>
-                <w:sz w:val="24"/>
-                <w:szCs w:val="24"/>
-              </w:rPr>
-              <w:t xml:space="preserve"> do MVP </w:t>
-            </w:r>
-            <w:proofErr w:type="spellStart"/>
-            <w:r>
-              <w:rPr>
-                <w:sz w:val="24"/>
-                <w:szCs w:val="24"/>
-              </w:rPr>
-              <w:t>validados</w:t>
-            </w:r>
-            <w:proofErr w:type="spellEnd"/>
-            <w:r>
-              <w:rPr>
-                <w:sz w:val="24"/>
-                <w:szCs w:val="24"/>
-              </w:rPr>
-              <w:t xml:space="preserve"> e </w:t>
-            </w:r>
-            <w:proofErr w:type="spellStart"/>
-            <w:r>
-              <w:rPr>
-                <w:sz w:val="24"/>
-                <w:szCs w:val="24"/>
-              </w:rPr>
-              <w:t>aprovados</w:t>
-            </w:r>
-            <w:proofErr w:type="spellEnd"/>
-            <w:r>
-              <w:rPr>
-                <w:sz w:val="24"/>
-                <w:szCs w:val="24"/>
-              </w:rPr>
-              <w:t xml:space="preserve"> pela </w:t>
-            </w:r>
-            <w:proofErr w:type="spellStart"/>
-            <w:r>
-              <w:rPr>
-                <w:sz w:val="24"/>
-                <w:szCs w:val="24"/>
-              </w:rPr>
-              <w:t>contratante</w:t>
-            </w:r>
-            <w:proofErr w:type="spellEnd"/>
-            <w:r>
-              <w:rPr>
-                <w:sz w:val="24"/>
-                <w:szCs w:val="24"/>
-              </w:rPr>
-              <w:t>.</w:t>
+              <w:t>Até 2 dias úteis após o início</w:t>
             </w:r>
           </w:p>
         </w:tc>
@@ -1857,7 +2122,7 @@
         <w:tc>
           <w:tcPr>
             <w:cnfStyle w:val="001000000000" w:firstRow="0" w:lastRow="0" w:firstColumn="1" w:lastColumn="0" w:oddVBand="0" w:evenVBand="0" w:oddHBand="0" w:evenHBand="0" w:firstRowFirstColumn="0" w:firstRowLastColumn="0" w:lastRowFirstColumn="0" w:lastRowLastColumn="0"/>
-            <w:tcW w:w="959" w:type="dxa"/>
+            <w:tcW w:w="2235" w:type="dxa"/>
           </w:tcPr>
           <w:p>
             <w:pPr>
@@ -1872,13 +2137,13 @@
                 <w:sz w:val="24"/>
                 <w:szCs w:val="24"/>
               </w:rPr>
-              <w:t>2</w:t>
+              <w:t>2. Desenvolvimento e implementação</w:t>
             </w:r>
           </w:p>
         </w:tc>
         <w:tc>
           <w:tcPr>
-            <w:tcW w:w="1276" w:type="dxa"/>
+            <w:tcW w:w="5811" w:type="dxa"/>
           </w:tcPr>
           <w:p>
             <w:pPr>
@@ -1894,13 +2159,13 @@
                 <w:sz w:val="24"/>
                 <w:szCs w:val="24"/>
               </w:rPr>
-              <w:t>20 a 26/08</w:t>
+              <w:t>Implementação das funcionalidades, estrutura do portal, painel administrativo, integrações e demais itens previstos no escopo.</w:t>
             </w:r>
           </w:p>
         </w:tc>
         <w:tc>
           <w:tcPr>
-            <w:tcW w:w="1815" w:type="dxa"/>
+            <w:tcW w:w="2552" w:type="dxa"/>
           </w:tcPr>
           <w:p>
             <w:pPr>
@@ -1911,157 +2176,12 @@
                 <w:szCs w:val="24"/>
               </w:rPr>
             </w:pPr>
-            <w:proofErr w:type="spellStart"/>
             <w:r>
               <w:rPr>
                 <w:sz w:val="24"/>
                 <w:szCs w:val="24"/>
               </w:rPr>
-              <w:t>Modelagem</w:t>
-            </w:r>
-            <w:proofErr w:type="spellEnd"/>
-            <w:r>
-              <w:rPr>
-                <w:sz w:val="24"/>
-                <w:szCs w:val="24"/>
-              </w:rPr>
-              <w:t xml:space="preserve"> </w:t>
-            </w:r>
-            <w:proofErr w:type="spellStart"/>
-            <w:r>
-              <w:rPr>
-                <w:sz w:val="24"/>
-                <w:szCs w:val="24"/>
-              </w:rPr>
-              <w:t>técnica</w:t>
-            </w:r>
-            <w:proofErr w:type="spellEnd"/>
-          </w:p>
-        </w:tc>
-        <w:tc>
-          <w:tcPr>
-            <w:tcW w:w="6406" w:type="dxa"/>
-          </w:tcPr>
-          <w:p>
-            <w:pPr>
-              <w:spacing w:after="0" w:line="252" w:lineRule="auto"/>
-              <w:cnfStyle w:val="000000000000" w:firstRow="0" w:lastRow="0" w:firstColumn="0" w:lastColumn="0" w:oddVBand="0" w:evenVBand="0" w:oddHBand="0" w:evenHBand="0" w:firstRowFirstColumn="0" w:firstRowLastColumn="0" w:lastRowFirstColumn="0" w:lastRowLastColumn="0"/>
-              <w:rPr>
-                <w:sz w:val="24"/>
-                <w:szCs w:val="24"/>
-              </w:rPr>
-            </w:pPr>
-            <w:proofErr w:type="spellStart"/>
-            <w:r>
-              <w:rPr>
-                <w:sz w:val="24"/>
-                <w:szCs w:val="24"/>
-              </w:rPr>
-              <w:t>Diagrama</w:t>
-            </w:r>
-            <w:proofErr w:type="spellEnd"/>
-            <w:r>
-              <w:rPr>
-                <w:sz w:val="24"/>
-                <w:szCs w:val="24"/>
-              </w:rPr>
-              <w:t xml:space="preserve"> de </w:t>
-            </w:r>
-            <w:proofErr w:type="spellStart"/>
-            <w:r>
-              <w:rPr>
-                <w:sz w:val="24"/>
-                <w:szCs w:val="24"/>
-              </w:rPr>
-              <w:t>casos</w:t>
-            </w:r>
-            <w:proofErr w:type="spellEnd"/>
-            <w:r>
-              <w:rPr>
-                <w:sz w:val="24"/>
-                <w:szCs w:val="24"/>
-              </w:rPr>
-              <w:t xml:space="preserve"> de </w:t>
-            </w:r>
-            <w:proofErr w:type="spellStart"/>
-            <w:r>
-              <w:rPr>
-                <w:sz w:val="24"/>
-                <w:szCs w:val="24"/>
-              </w:rPr>
-              <w:t>uso</w:t>
-            </w:r>
-            <w:proofErr w:type="spellEnd"/>
-            <w:r>
-              <w:rPr>
-                <w:sz w:val="24"/>
-                <w:szCs w:val="24"/>
-              </w:rPr>
-              <w:t xml:space="preserve">, </w:t>
-            </w:r>
-            <w:proofErr w:type="spellStart"/>
-            <w:r>
-              <w:rPr>
-                <w:sz w:val="24"/>
-                <w:szCs w:val="24"/>
-              </w:rPr>
-              <w:t>diagrama</w:t>
-            </w:r>
-            <w:proofErr w:type="spellEnd"/>
-            <w:r>
-              <w:rPr>
-                <w:sz w:val="24"/>
-                <w:szCs w:val="24"/>
-              </w:rPr>
-              <w:t xml:space="preserve"> de classes, </w:t>
-            </w:r>
-            <w:proofErr w:type="spellStart"/>
-            <w:r>
-              <w:rPr>
-                <w:sz w:val="24"/>
-                <w:szCs w:val="24"/>
-              </w:rPr>
-              <w:t>modelagem</w:t>
-            </w:r>
-            <w:proofErr w:type="spellEnd"/>
-            <w:r>
-              <w:rPr>
-                <w:sz w:val="24"/>
-                <w:szCs w:val="24"/>
-              </w:rPr>
-              <w:t xml:space="preserve"> do banco de dados e </w:t>
-            </w:r>
-            <w:proofErr w:type="spellStart"/>
-            <w:r>
-              <w:rPr>
-                <w:sz w:val="24"/>
-                <w:szCs w:val="24"/>
-              </w:rPr>
-              <w:t>definição</w:t>
-            </w:r>
-            <w:proofErr w:type="spellEnd"/>
-            <w:r>
-              <w:rPr>
-                <w:sz w:val="24"/>
-                <w:szCs w:val="24"/>
-              </w:rPr>
-              <w:t xml:space="preserve"> das </w:t>
-            </w:r>
-            <w:proofErr w:type="spellStart"/>
-            <w:r>
-              <w:rPr>
-                <w:sz w:val="24"/>
-                <w:szCs w:val="24"/>
-              </w:rPr>
-              <w:t>tabelas</w:t>
-            </w:r>
-            <w:proofErr w:type="spellEnd"/>
-            <w:r>
-              <w:rPr>
-                <w:sz w:val="24"/>
-                <w:szCs w:val="24"/>
-              </w:rPr>
-              <w:t xml:space="preserve"> SQL.</w:t>
+              <w:t>Conforme disponibilidade dos recursos necessários</w:t>
             </w:r>
           </w:p>
         </w:tc>
@@ -2070,7 +2190,7 @@
         <w:tc>
           <w:tcPr>
             <w:cnfStyle w:val="001000000000" w:firstRow="0" w:lastRow="0" w:firstColumn="1" w:lastColumn="0" w:oddVBand="0" w:evenVBand="0" w:oddHBand="0" w:evenHBand="0" w:firstRowFirstColumn="0" w:firstRowLastColumn="0" w:lastRowFirstColumn="0" w:lastRowLastColumn="0"/>
-            <w:tcW w:w="959" w:type="dxa"/>
+            <w:tcW w:w="2235" w:type="dxa"/>
           </w:tcPr>
           <w:p>
             <w:pPr>
@@ -2085,13 +2205,13 @@
                 <w:sz w:val="24"/>
                 <w:szCs w:val="24"/>
               </w:rPr>
-              <w:t>3</w:t>
+              <w:t>3. Integrações e configurações</w:t>
             </w:r>
           </w:p>
         </w:tc>
         <w:tc>
           <w:tcPr>
-            <w:tcW w:w="1276" w:type="dxa"/>
+            <w:tcW w:w="5811" w:type="dxa"/>
           </w:tcPr>
           <w:p>
             <w:pPr>
@@ -2107,13 +2227,13 @@
                 <w:sz w:val="24"/>
                 <w:szCs w:val="24"/>
               </w:rPr>
-              <w:t>27/08 a 02/09</w:t>
+              <w:t>Configuração das integrações previstas, incluindo Google Analytics, armazenamento S3, OpenTelemetry e serviço de envio de e-mails, conforme disponibilização das credenciais e serviços pela CONTRATANTE.</w:t>
             </w:r>
           </w:p>
         </w:tc>
         <w:tc>
           <w:tcPr>
-            <w:tcW w:w="1815" w:type="dxa"/>
+            <w:tcW w:w="2552" w:type="dxa"/>
           </w:tcPr>
           <w:p>
             <w:pPr>
@@ -2124,173 +2244,12 @@
                 <w:szCs w:val="24"/>
               </w:rPr>
             </w:pPr>
-            <w:proofErr w:type="spellStart"/>
             <w:r>
               <w:rPr>
                 <w:sz w:val="24"/>
                 <w:szCs w:val="24"/>
               </w:rPr>
-              <w:t>Estrutura</w:t>
-            </w:r>
-            <w:proofErr w:type="spellEnd"/>
-            <w:r>
-              <w:rPr>
-                <w:sz w:val="24"/>
-                <w:szCs w:val="24"/>
-              </w:rPr>
-              <w:t xml:space="preserve"> e </w:t>
-            </w:r>
-            <w:proofErr w:type="gramStart"/>
-            <w:r>
-              <w:rPr>
-                <w:sz w:val="24"/>
-                <w:szCs w:val="24"/>
-              </w:rPr>
-              <w:t>base</w:t>
-            </w:r>
-            <w:proofErr w:type="gramEnd"/>
-            <w:r>
-              <w:rPr>
-                <w:sz w:val="24"/>
-                <w:szCs w:val="24"/>
-              </w:rPr>
-              <w:t xml:space="preserve"> da </w:t>
-            </w:r>
-            <w:proofErr w:type="spellStart"/>
-            <w:r>
-              <w:rPr>
-                <w:sz w:val="24"/>
-                <w:szCs w:val="24"/>
-              </w:rPr>
-              <w:t>aplicação</w:t>
-            </w:r>
-            <w:proofErr w:type="spellEnd"/>
-          </w:p>
-        </w:tc>
-        <w:tc>
-          <w:tcPr>
-            <w:tcW w:w="6406" w:type="dxa"/>
-          </w:tcPr>
-          <w:p>
-            <w:pPr>
-              <w:spacing w:after="0" w:line="252" w:lineRule="auto"/>
-              <w:cnfStyle w:val="000000000000" w:firstRow="0" w:lastRow="0" w:firstColumn="0" w:lastColumn="0" w:oddVBand="0" w:evenVBand="0" w:oddHBand="0" w:evenHBand="0" w:firstRowFirstColumn="0" w:firstRowLastColumn="0" w:lastRowFirstColumn="0" w:lastRowLastColumn="0"/>
-              <w:rPr>
-                <w:sz w:val="24"/>
-                <w:szCs w:val="24"/>
-              </w:rPr>
-            </w:pPr>
-            <w:proofErr w:type="spellStart"/>
-            <w:r>
-              <w:rPr>
-                <w:sz w:val="24"/>
-                <w:szCs w:val="24"/>
-              </w:rPr>
-              <w:t>Estrutura</w:t>
-            </w:r>
-            <w:proofErr w:type="spellEnd"/>
-            <w:r>
-              <w:rPr>
-                <w:sz w:val="24"/>
-                <w:szCs w:val="24"/>
-              </w:rPr>
-              <w:t xml:space="preserve"> </w:t>
-            </w:r>
-            <w:proofErr w:type="spellStart"/>
-            <w:r>
-              <w:rPr>
-                <w:sz w:val="24"/>
-                <w:szCs w:val="24"/>
-              </w:rPr>
-              <w:t>inicial</w:t>
-            </w:r>
-            <w:proofErr w:type="spellEnd"/>
-            <w:r>
-              <w:rPr>
-                <w:sz w:val="24"/>
-                <w:szCs w:val="24"/>
-              </w:rPr>
-              <w:t xml:space="preserve"> do </w:t>
-            </w:r>
-            <w:proofErr w:type="spellStart"/>
-            <w:r>
-              <w:rPr>
-                <w:sz w:val="24"/>
-                <w:szCs w:val="24"/>
-              </w:rPr>
-              <w:t>projeto</w:t>
-            </w:r>
-            <w:proofErr w:type="spellEnd"/>
-            <w:r>
-              <w:rPr>
-                <w:sz w:val="24"/>
-                <w:szCs w:val="24"/>
-              </w:rPr>
-              <w:t xml:space="preserve">, </w:t>
-            </w:r>
-            <w:proofErr w:type="spellStart"/>
-            <w:r>
-              <w:rPr>
-                <w:sz w:val="24"/>
-                <w:szCs w:val="24"/>
-              </w:rPr>
-              <w:t>configurações</w:t>
-            </w:r>
-            <w:proofErr w:type="spellEnd"/>
-            <w:r>
-              <w:rPr>
-                <w:sz w:val="24"/>
-                <w:szCs w:val="24"/>
-              </w:rPr>
-              <w:t xml:space="preserve">, </w:t>
-            </w:r>
-            <w:proofErr w:type="spellStart"/>
-            <w:r>
-              <w:rPr>
-                <w:sz w:val="24"/>
-                <w:szCs w:val="24"/>
-              </w:rPr>
-              <w:t>conexão</w:t>
-            </w:r>
-            <w:proofErr w:type="spellEnd"/>
-            <w:r>
-              <w:rPr>
-                <w:sz w:val="24"/>
-                <w:szCs w:val="24"/>
-              </w:rPr>
-              <w:t xml:space="preserve"> com o banco de dados, </w:t>
-            </w:r>
-            <w:proofErr w:type="spellStart"/>
-            <w:r>
-              <w:rPr>
-                <w:sz w:val="24"/>
-                <w:szCs w:val="24"/>
-              </w:rPr>
-              <w:t>autenticação</w:t>
-            </w:r>
-            <w:proofErr w:type="spellEnd"/>
-            <w:r>
-              <w:rPr>
-                <w:sz w:val="24"/>
-                <w:szCs w:val="24"/>
-              </w:rPr>
-              <w:t xml:space="preserve"> </w:t>
-            </w:r>
-            <w:proofErr w:type="spellStart"/>
-            <w:r>
-              <w:rPr>
-                <w:sz w:val="24"/>
-                <w:szCs w:val="24"/>
-              </w:rPr>
-              <w:t>administrativa</w:t>
-            </w:r>
-            <w:proofErr w:type="spellEnd"/>
-            <w:r>
-              <w:rPr>
-                <w:sz w:val="24"/>
-                <w:szCs w:val="24"/>
-              </w:rPr>
-              <w:t xml:space="preserve"> e base da API.</w:t>
+              <w:t>Conforme disponibilidade dos recursos necessários</w:t>
             </w:r>
           </w:p>
         </w:tc>
@@ -2299,7 +2258,7 @@
         <w:tc>
           <w:tcPr>
             <w:cnfStyle w:val="001000000000" w:firstRow="0" w:lastRow="0" w:firstColumn="1" w:lastColumn="0" w:oddVBand="0" w:evenVBand="0" w:oddHBand="0" w:evenHBand="0" w:firstRowFirstColumn="0" w:firstRowLastColumn="0" w:lastRowFirstColumn="0" w:lastRowLastColumn="0"/>
-            <w:tcW w:w="959" w:type="dxa"/>
+            <w:tcW w:w="2235" w:type="dxa"/>
           </w:tcPr>
           <w:p>
             <w:pPr>
@@ -2314,13 +2273,13 @@
                 <w:sz w:val="24"/>
                 <w:szCs w:val="24"/>
               </w:rPr>
-              <w:t>4</w:t>
+              <w:t>4. Testes e ajustes</w:t>
             </w:r>
           </w:p>
         </w:tc>
         <w:tc>
           <w:tcPr>
-            <w:tcW w:w="1276" w:type="dxa"/>
+            <w:tcW w:w="5811" w:type="dxa"/>
           </w:tcPr>
           <w:p>
             <w:pPr>
@@ -2336,13 +2295,13 @@
                 <w:sz w:val="24"/>
                 <w:szCs w:val="24"/>
               </w:rPr>
-              <w:t>03 a 09/09</w:t>
+              <w:t>Realização de testes, correções e ajustes necessários para adequação das funcionalidades ao escopo contratado.</w:t>
             </w:r>
           </w:p>
         </w:tc>
         <w:tc>
           <w:tcPr>
-            <w:tcW w:w="1815" w:type="dxa"/>
+            <w:tcW w:w="2552" w:type="dxa"/>
           </w:tcPr>
           <w:p>
             <w:pPr>
@@ -2353,237 +2312,12 @@
                 <w:szCs w:val="24"/>
               </w:rPr>
             </w:pPr>
-            <w:proofErr w:type="spellStart"/>
             <w:r>
               <w:rPr>
                 <w:sz w:val="24"/>
                 <w:szCs w:val="24"/>
               </w:rPr>
-              <w:t>Painel</w:t>
-            </w:r>
-            <w:proofErr w:type="spellEnd"/>
-            <w:r>
-              <w:rPr>
-                <w:sz w:val="24"/>
-                <w:szCs w:val="24"/>
-              </w:rPr>
-              <w:t xml:space="preserve"> </w:t>
-            </w:r>
-            <w:proofErr w:type="spellStart"/>
-            <w:r>
-              <w:rPr>
-                <w:sz w:val="24"/>
-                <w:szCs w:val="24"/>
-              </w:rPr>
-              <w:t>administrativo</w:t>
-            </w:r>
-            <w:proofErr w:type="spellEnd"/>
-            <w:r>
-              <w:rPr>
-                <w:sz w:val="24"/>
-                <w:szCs w:val="24"/>
-              </w:rPr>
-              <w:t xml:space="preserve"> e portal </w:t>
-            </w:r>
-            <w:proofErr w:type="spellStart"/>
-            <w:r>
-              <w:rPr>
-                <w:sz w:val="24"/>
-                <w:szCs w:val="24"/>
-              </w:rPr>
-              <w:t>público</w:t>
-            </w:r>
-            <w:proofErr w:type="spellEnd"/>
-          </w:p>
-        </w:tc>
-        <w:tc>
-          <w:tcPr>
-            <w:tcW w:w="6406" w:type="dxa"/>
-          </w:tcPr>
-          <w:p>
-            <w:pPr>
-              <w:spacing w:after="0" w:line="252" w:lineRule="auto"/>
-              <w:cnfStyle w:val="000000000000" w:firstRow="0" w:lastRow="0" w:firstColumn="0" w:lastColumn="0" w:oddVBand="0" w:evenVBand="0" w:oddHBand="0" w:evenHBand="0" w:firstRowFirstColumn="0" w:firstRowLastColumn="0" w:lastRowFirstColumn="0" w:lastRowLastColumn="0"/>
-              <w:rPr>
-                <w:sz w:val="24"/>
-                <w:szCs w:val="24"/>
-              </w:rPr>
-            </w:pPr>
-            <w:proofErr w:type="spellStart"/>
-            <w:r>
-              <w:rPr>
-                <w:sz w:val="24"/>
-                <w:szCs w:val="24"/>
-              </w:rPr>
-              <w:t>Gestão</w:t>
-            </w:r>
-            <w:proofErr w:type="spellEnd"/>
-            <w:r>
-              <w:rPr>
-                <w:sz w:val="24"/>
-                <w:szCs w:val="24"/>
-              </w:rPr>
-              <w:t xml:space="preserve"> de </w:t>
-            </w:r>
-            <w:proofErr w:type="spellStart"/>
-            <w:r>
-              <w:rPr>
-                <w:sz w:val="24"/>
-                <w:szCs w:val="24"/>
-              </w:rPr>
-              <w:t>categorias</w:t>
-            </w:r>
-            <w:proofErr w:type="spellEnd"/>
-            <w:r>
-              <w:rPr>
-                <w:sz w:val="24"/>
-                <w:szCs w:val="24"/>
-              </w:rPr>
-              <w:t xml:space="preserve"> e </w:t>
-            </w:r>
-            <w:proofErr w:type="spellStart"/>
-            <w:r>
-              <w:rPr>
-                <w:sz w:val="24"/>
-                <w:szCs w:val="24"/>
-              </w:rPr>
-              <w:t>publicações</w:t>
-            </w:r>
-            <w:proofErr w:type="spellEnd"/>
-            <w:r>
-              <w:rPr>
-                <w:sz w:val="24"/>
-                <w:szCs w:val="24"/>
-              </w:rPr>
-              <w:t xml:space="preserve">, </w:t>
-            </w:r>
-            <w:proofErr w:type="spellStart"/>
-            <w:r>
-              <w:rPr>
-                <w:sz w:val="24"/>
-                <w:szCs w:val="24"/>
-              </w:rPr>
-              <w:t>listagem</w:t>
-            </w:r>
-            <w:proofErr w:type="spellEnd"/>
-            <w:r>
-              <w:rPr>
-                <w:sz w:val="24"/>
-                <w:szCs w:val="24"/>
-              </w:rPr>
-              <w:t xml:space="preserve"> </w:t>
-            </w:r>
-            <w:proofErr w:type="spellStart"/>
-            <w:r>
-              <w:rPr>
-                <w:sz w:val="24"/>
-                <w:szCs w:val="24"/>
-              </w:rPr>
-              <w:t>pública</w:t>
-            </w:r>
-            <w:proofErr w:type="spellEnd"/>
-            <w:r>
-              <w:rPr>
-                <w:sz w:val="24"/>
-                <w:szCs w:val="24"/>
-              </w:rPr>
-              <w:t xml:space="preserve">, </w:t>
-            </w:r>
-            <w:proofErr w:type="spellStart"/>
-            <w:r>
-              <w:rPr>
-                <w:sz w:val="24"/>
-                <w:szCs w:val="24"/>
-              </w:rPr>
-              <w:t>página</w:t>
-            </w:r>
-            <w:proofErr w:type="spellEnd"/>
-            <w:r>
-              <w:rPr>
-                <w:sz w:val="24"/>
-                <w:szCs w:val="24"/>
-              </w:rPr>
-              <w:t xml:space="preserve"> de </w:t>
-            </w:r>
-            <w:proofErr w:type="spellStart"/>
-            <w:r>
-              <w:rPr>
-                <w:sz w:val="24"/>
-                <w:szCs w:val="24"/>
-              </w:rPr>
-              <w:t>artigo</w:t>
-            </w:r>
-            <w:proofErr w:type="spellEnd"/>
-            <w:r>
-              <w:rPr>
-                <w:sz w:val="24"/>
-                <w:szCs w:val="24"/>
-              </w:rPr>
-              <w:t xml:space="preserve">, </w:t>
-            </w:r>
-            <w:proofErr w:type="spellStart"/>
-            <w:r>
-              <w:rPr>
-                <w:sz w:val="24"/>
-                <w:szCs w:val="24"/>
-              </w:rPr>
-              <w:t>filtros</w:t>
-            </w:r>
-            <w:proofErr w:type="spellEnd"/>
-            <w:r>
-              <w:rPr>
-                <w:sz w:val="24"/>
-                <w:szCs w:val="24"/>
-              </w:rPr>
-              <w:t xml:space="preserve">, </w:t>
-            </w:r>
-            <w:proofErr w:type="spellStart"/>
-            <w:r>
-              <w:rPr>
-                <w:sz w:val="24"/>
-                <w:szCs w:val="24"/>
-              </w:rPr>
-              <w:t>busca</w:t>
-            </w:r>
-            <w:proofErr w:type="spellEnd"/>
-            <w:r>
-              <w:rPr>
-                <w:sz w:val="24"/>
-                <w:szCs w:val="24"/>
-              </w:rPr>
-              <w:t xml:space="preserve"> e </w:t>
-            </w:r>
-            <w:proofErr w:type="spellStart"/>
-            <w:r>
-              <w:rPr>
-                <w:sz w:val="24"/>
-                <w:szCs w:val="24"/>
-              </w:rPr>
-              <w:t>estrutura</w:t>
-            </w:r>
-            <w:proofErr w:type="spellEnd"/>
-            <w:r>
-              <w:rPr>
-                <w:sz w:val="24"/>
-                <w:szCs w:val="24"/>
-              </w:rPr>
-              <w:t xml:space="preserve"> </w:t>
-            </w:r>
-            <w:proofErr w:type="spellStart"/>
-            <w:r>
-              <w:rPr>
-                <w:sz w:val="24"/>
-                <w:szCs w:val="24"/>
-              </w:rPr>
-              <w:t>responsiva</w:t>
-            </w:r>
-            <w:proofErr w:type="spellEnd"/>
-            <w:r>
-              <w:rPr>
-                <w:sz w:val="24"/>
-                <w:szCs w:val="24"/>
-              </w:rPr>
-              <w:t>.</w:t>
+              <w:t>Conforme evolução do projeto</w:t>
             </w:r>
           </w:p>
         </w:tc>
@@ -2592,7 +2326,7 @@
         <w:tc>
           <w:tcPr>
             <w:cnfStyle w:val="001000000000" w:firstRow="0" w:lastRow="0" w:firstColumn="1" w:lastColumn="0" w:oddVBand="0" w:evenVBand="0" w:oddHBand="0" w:evenHBand="0" w:firstRowFirstColumn="0" w:firstRowLastColumn="0" w:lastRowFirstColumn="0" w:lastRowLastColumn="0"/>
-            <w:tcW w:w="959" w:type="dxa"/>
+            <w:tcW w:w="2235" w:type="dxa"/>
           </w:tcPr>
           <w:p>
             <w:pPr>
@@ -2607,13 +2341,13 @@
                 <w:sz w:val="24"/>
                 <w:szCs w:val="24"/>
               </w:rPr>
-              <w:t>5</w:t>
+              <w:t>5. Homologação e entrega</w:t>
             </w:r>
           </w:p>
         </w:tc>
         <w:tc>
           <w:tcPr>
-            <w:tcW w:w="1276" w:type="dxa"/>
+            <w:tcW w:w="5811" w:type="dxa"/>
           </w:tcPr>
           <w:p>
             <w:pPr>
@@ -2629,13 +2363,13 @@
                 <w:sz w:val="24"/>
                 <w:szCs w:val="24"/>
               </w:rPr>
-              <w:t>10 a 16/09</w:t>
+              <w:t>Disponibilização do projeto para validação da CONTRATANTE, realização dos ajustes previstos no escopo e entrega final.</w:t>
             </w:r>
           </w:p>
         </w:tc>
         <w:tc>
           <w:tcPr>
-            <w:tcW w:w="1815" w:type="dxa"/>
+            <w:tcW w:w="2552" w:type="dxa"/>
           </w:tcPr>
           <w:p>
             <w:pPr>
@@ -2646,164 +2380,12 @@
                 <w:szCs w:val="24"/>
               </w:rPr>
             </w:pPr>
-            <w:proofErr w:type="spellStart"/>
             <w:r>
               <w:rPr>
                 <w:sz w:val="24"/>
                 <w:szCs w:val="24"/>
               </w:rPr>
-              <w:t>Métricas</w:t>
-            </w:r>
-            <w:proofErr w:type="spellEnd"/>
-            <w:r>
-              <w:rPr>
-                <w:sz w:val="24"/>
-                <w:szCs w:val="24"/>
-              </w:rPr>
-              <w:t xml:space="preserve"> e </w:t>
-            </w:r>
-            <w:proofErr w:type="spellStart"/>
-            <w:r>
-              <w:rPr>
-                <w:sz w:val="24"/>
-                <w:szCs w:val="24"/>
-              </w:rPr>
-              <w:t>indicadores</w:t>
-            </w:r>
-            <w:proofErr w:type="spellEnd"/>
-          </w:p>
-        </w:tc>
-        <w:tc>
-          <w:tcPr>
-            <w:tcW w:w="6406" w:type="dxa"/>
-          </w:tcPr>
-          <w:p>
-            <w:pPr>
-              <w:spacing w:after="0" w:line="252" w:lineRule="auto"/>
-              <w:cnfStyle w:val="000000000000" w:firstRow="0" w:lastRow="0" w:firstColumn="0" w:lastColumn="0" w:oddVBand="0" w:evenVBand="0" w:oddHBand="0" w:evenHBand="0" w:firstRowFirstColumn="0" w:firstRowLastColumn="0" w:lastRowFirstColumn="0" w:lastRowLastColumn="0"/>
-              <w:rPr>
-                <w:sz w:val="24"/>
-                <w:szCs w:val="24"/>
-              </w:rPr>
-            </w:pPr>
-            <w:r>
-              <w:rPr>
-                <w:sz w:val="24"/>
-                <w:szCs w:val="24"/>
-              </w:rPr>
-              <w:t xml:space="preserve">Registro de </w:t>
-            </w:r>
-            <w:proofErr w:type="spellStart"/>
-            <w:r>
-              <w:rPr>
-                <w:sz w:val="24"/>
-                <w:szCs w:val="24"/>
-              </w:rPr>
-              <w:t>visualizações</w:t>
-            </w:r>
-            <w:proofErr w:type="spellEnd"/>
-            <w:r>
-              <w:rPr>
-                <w:sz w:val="24"/>
-                <w:szCs w:val="24"/>
-              </w:rPr>
-              <w:t xml:space="preserve"> e </w:t>
-            </w:r>
-            <w:proofErr w:type="spellStart"/>
-            <w:r>
-              <w:rPr>
-                <w:sz w:val="24"/>
-                <w:szCs w:val="24"/>
-              </w:rPr>
-              <w:t>buscas</w:t>
-            </w:r>
-            <w:proofErr w:type="spellEnd"/>
-            <w:r>
-              <w:rPr>
-                <w:sz w:val="24"/>
-                <w:szCs w:val="24"/>
-              </w:rPr>
-              <w:t xml:space="preserve">, </w:t>
-            </w:r>
-            <w:proofErr w:type="spellStart"/>
-            <w:r>
-              <w:rPr>
-                <w:sz w:val="24"/>
-                <w:szCs w:val="24"/>
-              </w:rPr>
-              <w:t>consolidação</w:t>
-            </w:r>
-            <w:proofErr w:type="spellEnd"/>
-            <w:r>
-              <w:rPr>
-                <w:sz w:val="24"/>
-                <w:szCs w:val="24"/>
-              </w:rPr>
-              <w:t xml:space="preserve"> dos dados, </w:t>
-            </w:r>
-            <w:proofErr w:type="spellStart"/>
-            <w:r>
-              <w:rPr>
-                <w:sz w:val="24"/>
-                <w:szCs w:val="24"/>
-              </w:rPr>
-              <w:t>indicadores</w:t>
-            </w:r>
-            <w:proofErr w:type="spellEnd"/>
-            <w:r>
-              <w:rPr>
-                <w:sz w:val="24"/>
-                <w:szCs w:val="24"/>
-              </w:rPr>
-              <w:t xml:space="preserve"> e </w:t>
-            </w:r>
-            <w:proofErr w:type="spellStart"/>
-            <w:r>
-              <w:rPr>
-                <w:sz w:val="24"/>
-                <w:szCs w:val="24"/>
-              </w:rPr>
-              <w:t>gráficos</w:t>
-            </w:r>
-            <w:proofErr w:type="spellEnd"/>
-            <w:r>
-              <w:rPr>
-                <w:sz w:val="24"/>
-                <w:szCs w:val="24"/>
-              </w:rPr>
-              <w:t xml:space="preserve"> no </w:t>
-            </w:r>
-            <w:proofErr w:type="spellStart"/>
-            <w:r>
-              <w:rPr>
-                <w:sz w:val="24"/>
-                <w:szCs w:val="24"/>
-              </w:rPr>
-              <w:t>painel</w:t>
-            </w:r>
-            <w:proofErr w:type="spellEnd"/>
-            <w:r>
-              <w:rPr>
-                <w:sz w:val="24"/>
-                <w:szCs w:val="24"/>
-              </w:rPr>
-              <w:t xml:space="preserve"> </w:t>
-            </w:r>
-            <w:proofErr w:type="spellStart"/>
-            <w:r>
-              <w:rPr>
-                <w:sz w:val="24"/>
-                <w:szCs w:val="24"/>
-              </w:rPr>
-              <w:t>administrativo</w:t>
-            </w:r>
-            <w:proofErr w:type="spellEnd"/>
-            <w:r>
-              <w:rPr>
-                <w:sz w:val="24"/>
-                <w:szCs w:val="24"/>
-              </w:rPr>
-              <w:t>.</w:t>
+              <w:t>Após conclusão das etapas anteriores</w:t>
             </w:r>
           </w:p>
         </w:tc>
@@ -2812,7 +2394,7 @@
         <w:tc>
           <w:tcPr>
             <w:cnfStyle w:val="001000000000" w:firstRow="0" w:lastRow="0" w:firstColumn="1" w:lastColumn="0" w:oddVBand="0" w:evenVBand="0" w:oddHBand="0" w:evenHBand="0" w:firstRowFirstColumn="0" w:firstRowLastColumn="0" w:lastRowFirstColumn="0" w:lastRowLastColumn="0"/>
-            <w:tcW w:w="959" w:type="dxa"/>
+            <w:tcW w:w="2235" w:type="dxa"/>
           </w:tcPr>
           <w:p>
             <w:pPr>
@@ -2827,13 +2409,13 @@
                 <w:sz w:val="24"/>
                 <w:szCs w:val="24"/>
               </w:rPr>
-              <w:t>6</w:t>
+              <w:t>6. Implantação</w:t>
             </w:r>
           </w:p>
         </w:tc>
         <w:tc>
           <w:tcPr>
-            <w:tcW w:w="1276" w:type="dxa"/>
+            <w:tcW w:w="5811" w:type="dxa"/>
           </w:tcPr>
           <w:p>
             <w:pPr>
@@ -2849,13 +2431,13 @@
                 <w:sz w:val="24"/>
                 <w:szCs w:val="24"/>
               </w:rPr>
-              <w:t>17 a 26/09</w:t>
+              <w:t>Publicação do portal no ambiente de produção, mediante disponibilização da infraestrutura, domínio e demais acessos necessários pela CONTRATANTE.</w:t>
             </w:r>
           </w:p>
         </w:tc>
         <w:tc>
           <w:tcPr>
-            <w:tcW w:w="1815" w:type="dxa"/>
+            <w:tcW w:w="2552" w:type="dxa"/>
           </w:tcPr>
           <w:p>
             <w:pPr>
@@ -2866,180 +2448,12 @@
                 <w:szCs w:val="24"/>
               </w:rPr>
             </w:pPr>
-            <w:proofErr w:type="spellStart"/>
             <w:r>
               <w:rPr>
                 <w:sz w:val="24"/>
                 <w:szCs w:val="24"/>
               </w:rPr>
-              <w:t>Homologação</w:t>
-            </w:r>
-            <w:proofErr w:type="spellEnd"/>
-            <w:r>
-              <w:rPr>
-                <w:sz w:val="24"/>
-                <w:szCs w:val="24"/>
-              </w:rPr>
-              <w:t xml:space="preserve">, </w:t>
-            </w:r>
-            <w:proofErr w:type="spellStart"/>
-            <w:r>
-              <w:rPr>
-                <w:sz w:val="24"/>
-                <w:szCs w:val="24"/>
-              </w:rPr>
-              <w:t>ajustes</w:t>
-            </w:r>
-            <w:proofErr w:type="spellEnd"/>
-            <w:r>
-              <w:rPr>
-                <w:sz w:val="24"/>
-                <w:szCs w:val="24"/>
-              </w:rPr>
-              <w:t xml:space="preserve"> e </w:t>
-            </w:r>
-            <w:proofErr w:type="spellStart"/>
-            <w:r>
-              <w:rPr>
-                <w:sz w:val="24"/>
-                <w:szCs w:val="24"/>
-              </w:rPr>
-              <w:t>publicação</w:t>
-            </w:r>
-            <w:proofErr w:type="spellEnd"/>
-          </w:p>
-        </w:tc>
-        <w:tc>
-          <w:tcPr>
-            <w:tcW w:w="6406" w:type="dxa"/>
-          </w:tcPr>
-          <w:p>
-            <w:pPr>
-              <w:spacing w:after="0" w:line="252" w:lineRule="auto"/>
-              <w:cnfStyle w:val="000000000000" w:firstRow="0" w:lastRow="0" w:firstColumn="0" w:lastColumn="0" w:oddVBand="0" w:evenVBand="0" w:oddHBand="0" w:evenHBand="0" w:firstRowFirstColumn="0" w:firstRowLastColumn="0" w:lastRowFirstColumn="0" w:lastRowLastColumn="0"/>
-              <w:rPr>
-                <w:sz w:val="24"/>
-                <w:szCs w:val="24"/>
-              </w:rPr>
-            </w:pPr>
-            <w:r>
-              <w:rPr>
-                <w:sz w:val="24"/>
-                <w:szCs w:val="24"/>
-              </w:rPr>
-              <w:t xml:space="preserve">Testes, </w:t>
-            </w:r>
-            <w:proofErr w:type="spellStart"/>
-            <w:r>
-              <w:rPr>
-                <w:sz w:val="24"/>
-                <w:szCs w:val="24"/>
-              </w:rPr>
-              <w:t>correções</w:t>
-            </w:r>
-            <w:proofErr w:type="spellEnd"/>
-            <w:r>
-              <w:rPr>
-                <w:sz w:val="24"/>
-                <w:szCs w:val="24"/>
-              </w:rPr>
-              <w:t xml:space="preserve">, </w:t>
-            </w:r>
-            <w:proofErr w:type="spellStart"/>
-            <w:r>
-              <w:rPr>
-                <w:sz w:val="24"/>
-                <w:szCs w:val="24"/>
-              </w:rPr>
-              <w:t>ajustes</w:t>
-            </w:r>
-            <w:proofErr w:type="spellEnd"/>
-            <w:r>
-              <w:rPr>
-                <w:sz w:val="24"/>
-                <w:szCs w:val="24"/>
-              </w:rPr>
-              <w:t xml:space="preserve"> </w:t>
-            </w:r>
-            <w:proofErr w:type="spellStart"/>
-            <w:r>
-              <w:rPr>
-                <w:sz w:val="24"/>
-                <w:szCs w:val="24"/>
-              </w:rPr>
-              <w:t>previstos</w:t>
-            </w:r>
-            <w:proofErr w:type="spellEnd"/>
-            <w:r>
-              <w:rPr>
-                <w:sz w:val="24"/>
-                <w:szCs w:val="24"/>
-              </w:rPr>
-              <w:t xml:space="preserve">, </w:t>
-            </w:r>
-            <w:proofErr w:type="spellStart"/>
-            <w:r>
-              <w:rPr>
-                <w:sz w:val="24"/>
-                <w:szCs w:val="24"/>
-              </w:rPr>
-              <w:t>validação</w:t>
-            </w:r>
-            <w:proofErr w:type="spellEnd"/>
-            <w:r>
-              <w:rPr>
-                <w:sz w:val="24"/>
-                <w:szCs w:val="24"/>
-              </w:rPr>
-              <w:t xml:space="preserve"> da </w:t>
-            </w:r>
-            <w:proofErr w:type="spellStart"/>
-            <w:r>
-              <w:rPr>
-                <w:sz w:val="24"/>
-                <w:szCs w:val="24"/>
-              </w:rPr>
-              <w:t>contratante</w:t>
-            </w:r>
-            <w:proofErr w:type="spellEnd"/>
-            <w:r>
-              <w:rPr>
-                <w:sz w:val="24"/>
-                <w:szCs w:val="24"/>
-              </w:rPr>
-              <w:t xml:space="preserve">, </w:t>
-            </w:r>
-            <w:proofErr w:type="spellStart"/>
-            <w:r>
-              <w:rPr>
-                <w:sz w:val="24"/>
-                <w:szCs w:val="24"/>
-              </w:rPr>
-              <w:t>implantação</w:t>
-            </w:r>
-            <w:proofErr w:type="spellEnd"/>
-            <w:r>
-              <w:rPr>
-                <w:sz w:val="24"/>
-                <w:szCs w:val="24"/>
-              </w:rPr>
-              <w:t xml:space="preserve"> e </w:t>
-            </w:r>
-            <w:proofErr w:type="spellStart"/>
-            <w:r>
-              <w:rPr>
-                <w:sz w:val="24"/>
-                <w:szCs w:val="24"/>
-              </w:rPr>
-              <w:t>entrega</w:t>
-            </w:r>
-            <w:proofErr w:type="spellEnd"/>
-            <w:r>
-              <w:rPr>
-                <w:sz w:val="24"/>
-                <w:szCs w:val="24"/>
-              </w:rPr>
-              <w:t xml:space="preserve"> final.</w:t>
+              <w:t>Conforme disponibilidade da infraestrutura</w:t>
             </w:r>
           </w:p>
         </w:tc>
@@ -3065,29 +2479,13 @@
           <w:color w:val="FE3000"/>
           <w:sz w:val="21"/>
         </w:rPr>
-        <w:t xml:space="preserve">MARCOS </w:t>
-      </w:r>
-      <w:proofErr w:type="gramStart"/>
-      <w:r>
-        <w:rPr>
-          <w:b/>
-          <w:color w:val="FE3000"/>
-          <w:sz w:val="21"/>
-        </w:rPr>
-        <w:t xml:space="preserve">PREVISTOS  </w:t>
+        <w:t xml:space="preserve">MARCOS PREVISTOS  </w:t>
       </w:r>
       <w:r>
         <w:rPr>
           <w:sz w:val="21"/>
         </w:rPr>
-        <w:t>Início</w:t>
-      </w:r>
-      <w:proofErr w:type="gramEnd"/>
-      <w:r>
-        <w:rPr>
-          <w:sz w:val="21"/>
-        </w:rPr>
-        <w:t xml:space="preserve"> em 13/08/2026 e entrega final até 26/09/2026, completando 45 dias corridos. </w:t>
+        <w:t xml:space="preserve">Início em 13/08/2026 e entrega final até 26/09/2026, completando 45 dias corridos. </w:t>
       </w:r>
     </w:p>
     <w:p>
@@ -3434,15 +2832,7 @@
         <w:pStyle w:val="Ttulo2"/>
       </w:pPr>
       <w:r>
-        <w:t xml:space="preserve">8.1 </w:t>
-      </w:r>
-      <w:proofErr w:type="spellStart"/>
-      <w:r>
-        <w:t>Responsabilidades</w:t>
-      </w:r>
-      <w:proofErr w:type="spellEnd"/>
-      <w:r>
-        <w:t xml:space="preserve"> d</w:t>
+        <w:t>8.1 Responsabilidades d</w:t>
       </w:r>
       <w:r>
         <w:t>o</w:t>
@@ -3450,11 +2840,9 @@
       <w:r>
         <w:t xml:space="preserve"> </w:t>
       </w:r>
-      <w:proofErr w:type="spellStart"/>
       <w:r>
         <w:t>contratado</w:t>
       </w:r>
-      <w:proofErr w:type="spellEnd"/>
     </w:p>
     <w:p>
       <w:pPr>
@@ -4131,15 +3519,7 @@
       </w:r>
       <w:proofErr w:type="spellEnd"/>
       <w:r>
-        <w:t xml:space="preserve"> requisitos, integrações, volume de conteúdo, infraestrutura, identidade aprovada ou entregáveis será analisada quanto </w:t>
-      </w:r>
-      <w:proofErr w:type="gramStart"/>
-      <w:r>
-        <w:t>a</w:t>
-      </w:r>
-      <w:proofErr w:type="gramEnd"/>
-      <w:r>
-        <w:t xml:space="preserve"> impacto. A execução dependerá de autorização escrita e, quando necessário, de aditivo de prazo e esforço.</w:t>
+        <w:t xml:space="preserve"> requisitos, integrações, volume de conteúdo, infraestrutura, identidade aprovada ou entregáveis será analisada quanto a impacto. A execução dependerá de autorização escrita e, quando necessário, de aditivo de prazo e esforço.</w:t>
       </w:r>
     </w:p>
     <w:p>
@@ -4155,7 +3535,39 @@
       </w:r>
       <w:proofErr w:type="spellEnd"/>
       <w:r>
-        <w:t xml:space="preserve"> do MVP poderá ser usada para preservar o prazo quando surgirem </w:t>
+        <w:t xml:space="preserve"> do MVP </w:t>
+      </w:r>
+      <w:proofErr w:type="spellStart"/>
+      <w:r>
+        <w:t>poderá</w:t>
+      </w:r>
+      <w:proofErr w:type="spellEnd"/>
+      <w:r>
+        <w:t xml:space="preserve"> ser usada para preservar o </w:t>
+      </w:r>
+      <w:proofErr w:type="spellStart"/>
+      <w:r>
+        <w:t>prazo</w:t>
+      </w:r>
+      <w:proofErr w:type="spellEnd"/>
+      <w:r>
+        <w:t xml:space="preserve"> </w:t>
+      </w:r>
+      <w:proofErr w:type="spellStart"/>
+      <w:r>
+        <w:t>quando</w:t>
+      </w:r>
+      <w:proofErr w:type="spellEnd"/>
+      <w:r>
+        <w:t xml:space="preserve"> </w:t>
+      </w:r>
+      <w:proofErr w:type="spellStart"/>
+      <w:r>
+        <w:t>surgirem</w:t>
+      </w:r>
+      <w:proofErr w:type="spellEnd"/>
+      <w:r>
+        <w:t xml:space="preserve"> </w:t>
       </w:r>
       <w:proofErr w:type="spellStart"/>
       <w:r>
@@ -4208,11 +3620,6 @@
     </w:p>
     <w:p>
       <w:pPr>
-        <w:jc w:val="both"/>
-      </w:pPr>
-    </w:p>
-    <w:p>
-      <w:pPr>
         <w:pStyle w:val="Ttulo1"/>
         <w:rPr>
           <w:lang w:val="pt-BR"/>
@@ -4284,7 +3691,19 @@
               <w:rPr>
                 <w:lang w:val="pt-BR"/>
               </w:rPr>
-              <w:t>R$ 3.600,00</w:t>
+              <w:t>R$ 3.</w:t>
+            </w:r>
+            <w:r>
+              <w:rPr>
+                <w:lang w:val="pt-BR"/>
+              </w:rPr>
+              <w:t>5</w:t>
+            </w:r>
+            <w:r>
+              <w:rPr>
+                <w:lang w:val="pt-BR"/>
+              </w:rPr>
+              <w:t>00,00</w:t>
             </w:r>
           </w:p>
         </w:tc>
@@ -4368,13 +3787,8 @@
       <w:pPr>
         <w:jc w:val="both"/>
       </w:pPr>
-      <w:proofErr w:type="gramStart"/>
       <w:r>
-        <w:t>A</w:t>
-      </w:r>
-      <w:proofErr w:type="gramEnd"/>
-      <w:r>
-        <w:t xml:space="preserve"> </w:t>
+        <w:t xml:space="preserve">A </w:t>
       </w:r>
       <w:proofErr w:type="spellStart"/>
       <w:r>
@@ -4398,23 +3812,31 @@
       </w:r>
       <w:proofErr w:type="spellEnd"/>
       <w:r>
-        <w:t xml:space="preserve"> </w:t>
+        <w:t xml:space="preserve"> em 13 de agosto de 2026 se a proposta estiver aprovada e os materiais, acessos e responsáveis pela validação estiverem disponíveis. Caso a aprovação ocorra posteriormente, o cronograma deverá ser recalculado preservando a sequência e a duração relativa das etapas.</w:t>
+      </w:r>
+    </w:p>
+    <w:p>
+      <w:pPr>
+        <w:jc w:val="both"/>
+      </w:pPr>
+      <w:r>
+        <w:t xml:space="preserve">A assinatura abaixo registra concordância com o escopo, o cronograma, as premissas e o procedimento de controle de mudanças. </w:t>
       </w:r>
       <w:proofErr w:type="spellStart"/>
       <w:r>
-        <w:t>em</w:t>
+        <w:t>Os</w:t>
       </w:r>
       <w:proofErr w:type="spellEnd"/>
       <w:r>
-        <w:t xml:space="preserve"> 13 de agosto de 2026 se a proposta estiver aprovada e os materiais, acessos e responsáveis pela validação estiverem disponíveis. Caso a aprovação ocorra posteriormente, o cronograma deverá ser recalculado preservando a sequência e a duração relativa das etapas.</w:t>
+        <w:t xml:space="preserve"> campos </w:t>
       </w:r>
-    </w:p>
-    <w:p>
-      <w:pPr>
-        <w:jc w:val="both"/>
-      </w:pPr>
+      <w:proofErr w:type="spellStart"/>
       <w:r>
-        <w:t xml:space="preserve">A assinatura abaixo registra concordância com o escopo, o cronograma, as premissas e o procedimento de controle de mudanças. Os campos comerciais </w:t>
+        <w:t>comerciais</w:t>
+      </w:r>
+      <w:proofErr w:type="spellEnd"/>
+      <w:r>
+        <w:t xml:space="preserve"> </w:t>
       </w:r>
       <w:proofErr w:type="spellStart"/>
       <w:r>
@@ -4765,7 +4187,7 @@
 </file>
 
 <file path=word/endnotes.xml><?xml version="1.0" encoding="utf-8"?>
-<w:endnotes xmlns:wpc="http://schemas.microsoft.com/office/word/2010/wordprocessingCanvas" xmlns:cx="http://schemas.microsoft.com/office/drawing/2014/chartex" xmlns:cx1="http://schemas.microsoft.com/office/drawing/2015/9/8/chartex" xmlns:cx2="http://schemas.microsoft.com/office/drawing/2015/10/21/chartex" xmlns:cx3="http://schemas.microsoft.com/office/drawing/2016/5/9/chartex" xmlns:cx4="http://schemas.microsoft.com/office/drawing/2016/5/10/chartex" xmlns:cx5="http://schemas.microsoft.com/office/drawing/2016/5/11/chartex" xmlns:cx6="http://schemas.microsoft.com/office/drawing/2016/5/12/chartex" xmlns:cx7="http://schemas.microsoft.com/office/drawing/2016/5/13/chartex" xmlns:cx8="http://schemas.microsoft.com/office/drawing/2016/5/14/chartex" xmlns:mc="http://schemas.openxmlformats.org/markup-compatibility/2006" xmlns:aink="http://schemas.microsoft.com/office/drawing/2016/ink" xmlns:am3d="http://schemas.microsoft.com/office/drawing/2017/model3d" xmlns:o="urn:schemas-microsoft-com:office:office" xmlns:oel="http://schemas.microsoft.com/office/2019/extlst" xmlns:r="http://schemas.openxmlformats.org/officeDocument/2006/relationships" xmlns:m="http://schemas.openxmlformats.org/officeDocument/2006/math" xmlns:v="urn:schemas-microsoft-com:vml" xmlns:wp14="http://schemas.microsoft.com/office/word/2010/wordprocessingDrawing" xmlns:wp="http://schemas.openxmlformats.org/drawingml/2006/wordprocessingDrawing" xmlns:w10="urn:schemas-microsoft-com:office:word" xmlns:w="http://schemas.openxmlformats.org/wordprocessingml/2006/main" xmlns:w14="http://schemas.microsoft.com/office/word/2010/wordml" xmlns:w15="http://schemas.microsoft.com/office/word/2012/wordml" xmlns:w16cei="http://schemas.microsoft.com/office/word/2026/wordml/cei" xmlns:w16cex="http://schemas.microsoft.com/office/word/2018/wordml/cex" xmlns:w16cid="http://schemas.microsoft.com/office/word/2016/wordml/cid" xmlns:w16="http://schemas.microsoft.com/office/word/2018/wordml" xmlns:w16du="http://schemas.microsoft.com/office/word/2023/wordml/word16du" xmlns:w16sdtdh="http://schemas.microsoft.com/office/word/2020/wordml/sdtdatahash" xmlns:w16sdtfl="http://schemas.microsoft.com/office/word/2024/wordml/sdtformatlock" xmlns:w16se="http://schemas.microsoft.com/office/word/2015/wordml/symex" xmlns:wpg="http://schemas.microsoft.com/office/word/2010/wordprocessingGroup" xmlns:wpi="http://schemas.microsoft.com/office/word/2010/wordprocessingInk" xmlns:wne="http://schemas.microsoft.com/office/word/2006/wordml" xmlns:wps="http://schemas.microsoft.com/office/word/2010/wordprocessingShape" mc:Ignorable="w14 w15 w16se w16cid w16 w16cex w16sdtdh w16sdtfl w16du wp14">
+<w:endnotes xmlns:wpc="http://schemas.microsoft.com/office/word/2010/wordprocessingCanvas" xmlns:cx="http://schemas.microsoft.com/office/drawing/2014/chartex" xmlns:cx1="http://schemas.microsoft.com/office/drawing/2015/9/8/chartex" xmlns:cx2="http://schemas.microsoft.com/office/drawing/2015/10/21/chartex" xmlns:cx3="http://schemas.microsoft.com/office/drawing/2016/5/9/chartex" xmlns:cx4="http://schemas.microsoft.com/office/drawing/2016/5/10/chartex" xmlns:cx5="http://schemas.microsoft.com/office/drawing/2016/5/11/chartex" xmlns:cx6="http://schemas.microsoft.com/office/drawing/2016/5/12/chartex" xmlns:cx7="http://schemas.microsoft.com/office/drawing/2016/5/13/chartex" xmlns:cx8="http://schemas.microsoft.com/office/drawing/2016/5/14/chartex" xmlns:mc="http://schemas.openxmlformats.org/markup-compatibility/2006" xmlns:aink="http://schemas.microsoft.com/office/drawing/2016/ink" xmlns:am3d="http://schemas.microsoft.com/office/drawing/2017/model3d" xmlns:o="urn:schemas-microsoft-com:office:office" xmlns:oel="http://schemas.microsoft.com/office/2019/extlst" xmlns:r="http://schemas.openxmlformats.org/officeDocument/2006/relationships" xmlns:m="http://schemas.openxmlformats.org/officeDocument/2006/math" xmlns:v="urn:schemas-microsoft-com:vml" xmlns:wp14="http://schemas.microsoft.com/office/word/2010/wordprocessingDrawing" xmlns:wp="http://schemas.openxmlformats.org/drawingml/2006/wordprocessingDrawing" xmlns:w10="urn:schemas-microsoft-com:office:word" xmlns:w="http://schemas.openxmlformats.org/wordprocessingml/2006/main" xmlns:w14="http://schemas.microsoft.com/office/word/2010/wordml" xmlns:w15="http://schemas.microsoft.com/office/word/2012/wordml" xmlns:w16cex="http://schemas.microsoft.com/office/word/2018/wordml/cex" xmlns:w16cid="http://schemas.microsoft.com/office/word/2016/wordml/cid" xmlns:w16="http://schemas.microsoft.com/office/word/2018/wordml" xmlns:w16du="http://schemas.microsoft.com/office/word/2023/wordml/word16du" xmlns:w16sdtdh="http://schemas.microsoft.com/office/word/2020/wordml/sdtdatahash" xmlns:w16sdtfl="http://schemas.microsoft.com/office/word/2024/wordml/sdtformatlock" xmlns:w16se="http://schemas.microsoft.com/office/word/2015/wordml/symex" xmlns:wpg="http://schemas.microsoft.com/office/word/2010/wordprocessingGroup" xmlns:wpi="http://schemas.microsoft.com/office/word/2010/wordprocessingInk" xmlns:wne="http://schemas.microsoft.com/office/word/2006/wordml" xmlns:wps="http://schemas.microsoft.com/office/word/2010/wordprocessingShape" mc:Ignorable="w14 w15 w16se w16cid w16 w16cex w16sdtdh w16sdtfl w16du wp14">
   <w:endnote w:type="separator" w:id="-1">
     <w:p>
       <w:pPr>
@@ -4790,27 +4212,18 @@
 </file>
 
 <file path=word/footer1.xml><?xml version="1.0" encoding="utf-8"?>
-<w:ftr xmlns:wpc="http://schemas.microsoft.com/office/word/2010/wordprocessingCanvas" xmlns:cx="http://schemas.microsoft.com/office/drawing/2014/chartex" xmlns:cx1="http://schemas.microsoft.com/office/drawing/2015/9/8/chartex" xmlns:cx2="http://schemas.microsoft.com/office/drawing/2015/10/21/chartex" xmlns:cx3="http://schemas.microsoft.com/office/drawing/2016/5/9/chartex" xmlns:cx4="http://schemas.microsoft.com/office/drawing/2016/5/10/chartex" xmlns:cx5="http://schemas.microsoft.com/office/drawing/2016/5/11/chartex" xmlns:cx6="http://schemas.microsoft.com/office/drawing/2016/5/12/chartex" xmlns:cx7="http://schemas.microsoft.com/office/drawing/2016/5/13/chartex" xmlns:cx8="http://schemas.microsoft.com/office/drawing/2016/5/14/chartex" xmlns:mc="http://schemas.openxmlformats.org/markup-compatibility/2006" xmlns:aink="http://schemas.microsoft.com/office/drawing/2016/ink" xmlns:am3d="http://schemas.microsoft.com/office/drawing/2017/model3d" xmlns:o="urn:schemas-microsoft-com:office:office" xmlns:oel="http://schemas.microsoft.com/office/2019/extlst" xmlns:r="http://schemas.openxmlformats.org/officeDocument/2006/relationships" xmlns:m="http://schemas.openxmlformats.org/officeDocument/2006/math" xmlns:v="urn:schemas-microsoft-com:vml" xmlns:wp14="http://schemas.microsoft.com/office/word/2010/wordprocessingDrawing" xmlns:wp="http://schemas.openxmlformats.org/drawingml/2006/wordprocessingDrawing" xmlns:w10="urn:schemas-microsoft-com:office:word" xmlns:w="http://schemas.openxmlformats.org/wordprocessingml/2006/main" xmlns:w14="http://schemas.microsoft.com/office/word/2010/wordml" xmlns:w15="http://schemas.microsoft.com/office/word/2012/wordml" xmlns:w16cei="http://schemas.microsoft.com/office/word/2026/wordml/cei" xmlns:w16cex="http://schemas.microsoft.com/office/word/2018/wordml/cex" xmlns:w16cid="http://schemas.microsoft.com/office/word/2016/wordml/cid" xmlns:w16="http://schemas.microsoft.com/office/word/2018/wordml" xmlns:w16du="http://schemas.microsoft.com/office/word/2023/wordml/word16du" xmlns:w16sdtdh="http://schemas.microsoft.com/office/word/2020/wordml/sdtdatahash" xmlns:w16sdtfl="http://schemas.microsoft.com/office/word/2024/wordml/sdtformatlock" xmlns:w16se="http://schemas.microsoft.com/office/word/2015/wordml/symex" xmlns:wpg="http://schemas.microsoft.com/office/word/2010/wordprocessingGroup" xmlns:wpi="http://schemas.microsoft.com/office/word/2010/wordprocessingInk" xmlns:wne="http://schemas.microsoft.com/office/word/2006/wordml" xmlns:wps="http://schemas.microsoft.com/office/word/2010/wordprocessingShape" mc:Ignorable="w14 w15 w16se w16cid w16 w16cex w16sdtdh w16sdtfl w16du wp14">
+<w:ftr xmlns:wpc="http://schemas.microsoft.com/office/word/2010/wordprocessingCanvas" xmlns:cx="http://schemas.microsoft.com/office/drawing/2014/chartex" xmlns:cx1="http://schemas.microsoft.com/office/drawing/2015/9/8/chartex" xmlns:cx2="http://schemas.microsoft.com/office/drawing/2015/10/21/chartex" xmlns:cx3="http://schemas.microsoft.com/office/drawing/2016/5/9/chartex" xmlns:cx4="http://schemas.microsoft.com/office/drawing/2016/5/10/chartex" xmlns:cx5="http://schemas.microsoft.com/office/drawing/2016/5/11/chartex" xmlns:cx6="http://schemas.microsoft.com/office/drawing/2016/5/12/chartex" xmlns:cx7="http://schemas.microsoft.com/office/drawing/2016/5/13/chartex" xmlns:cx8="http://schemas.microsoft.com/office/drawing/2016/5/14/chartex" xmlns:mc="http://schemas.openxmlformats.org/markup-compatibility/2006" xmlns:aink="http://schemas.microsoft.com/office/drawing/2016/ink" xmlns:am3d="http://schemas.microsoft.com/office/drawing/2017/model3d" xmlns:o="urn:schemas-microsoft-com:office:office" xmlns:oel="http://schemas.microsoft.com/office/2019/extlst" xmlns:r="http://schemas.openxmlformats.org/officeDocument/2006/relationships" xmlns:m="http://schemas.openxmlformats.org/officeDocument/2006/math" xmlns:v="urn:schemas-microsoft-com:vml" xmlns:wp14="http://schemas.microsoft.com/office/word/2010/wordprocessingDrawing" xmlns:wp="http://schemas.openxmlformats.org/drawingml/2006/wordprocessingDrawing" xmlns:w10="urn:schemas-microsoft-com:office:word" xmlns:w="http://schemas.openxmlformats.org/wordprocessingml/2006/main" xmlns:w14="http://schemas.microsoft.com/office/word/2010/wordml" xmlns:w15="http://schemas.microsoft.com/office/word/2012/wordml" xmlns:w16cex="http://schemas.microsoft.com/office/word/2018/wordml/cex" xmlns:w16cid="http://schemas.microsoft.com/office/word/2016/wordml/cid" xmlns:w16="http://schemas.microsoft.com/office/word/2018/wordml" xmlns:w16du="http://schemas.microsoft.com/office/word/2023/wordml/word16du" xmlns:w16sdtdh="http://schemas.microsoft.com/office/word/2020/wordml/sdtdatahash" xmlns:w16sdtfl="http://schemas.microsoft.com/office/word/2024/wordml/sdtformatlock" xmlns:w16se="http://schemas.microsoft.com/office/word/2015/wordml/symex" xmlns:wpg="http://schemas.microsoft.com/office/word/2010/wordprocessingGroup" xmlns:wpi="http://schemas.microsoft.com/office/word/2010/wordprocessingInk" xmlns:wne="http://schemas.microsoft.com/office/word/2006/wordml" xmlns:wps="http://schemas.microsoft.com/office/word/2010/wordprocessingShape" mc:Ignorable="w14 w15 w16se w16cid w16 w16cex w16sdtdh w16sdtfl w16du wp14">
   <w:p>
     <w:pPr>
       <w:pStyle w:val="Rodap"/>
       <w:jc w:val="center"/>
     </w:pPr>
-    <w:proofErr w:type="gramStart"/>
     <w:r>
       <w:rPr>
         <w:color w:val="5F6368"/>
         <w:sz w:val="17"/>
       </w:rPr>
-      <w:t>MOVE.ON  •</w:t>
-    </w:r>
-    <w:proofErr w:type="gramEnd"/>
-    <w:r>
-      <w:rPr>
-        <w:color w:val="5F6368"/>
-        <w:sz w:val="17"/>
-      </w:rPr>
-      <w:t xml:space="preserve">  </w:t>
+      <w:t xml:space="preserve">MOVE.ON  •  </w:t>
     </w:r>
     <w:proofErr w:type="spellStart"/>
     <w:r>
@@ -4829,7 +4242,6 @@
       <w:t xml:space="preserve"> </w:t>
     </w:r>
     <w:proofErr w:type="spellStart"/>
-    <w:proofErr w:type="gramStart"/>
     <w:r>
       <w:rPr>
         <w:color w:val="5F6368"/>
@@ -4843,15 +4255,7 @@
         <w:color w:val="5F6368"/>
         <w:sz w:val="17"/>
       </w:rPr>
-      <w:t xml:space="preserve">  •</w:t>
-    </w:r>
-    <w:proofErr w:type="gramEnd"/>
-    <w:r>
-      <w:rPr>
-        <w:color w:val="5F6368"/>
-        <w:sz w:val="17"/>
-      </w:rPr>
-      <w:t xml:space="preserve">  Página </w:t>
+      <w:t xml:space="preserve">  •  Página </w:t>
     </w:r>
     <w:r>
       <w:rPr>
@@ -4893,7 +4297,7 @@
 </file>
 
 <file path=word/footnotes.xml><?xml version="1.0" encoding="utf-8"?>
-<w:footnotes xmlns:wpc="http://schemas.microsoft.com/office/word/2010/wordprocessingCanvas" xmlns:cx="http://schemas.microsoft.com/office/drawing/2014/chartex" xmlns:cx1="http://schemas.microsoft.com/office/drawing/2015/9/8/chartex" xmlns:cx2="http://schemas.microsoft.com/office/drawing/2015/10/21/chartex" xmlns:cx3="http://schemas.microsoft.com/office/drawing/2016/5/9/chartex" xmlns:cx4="http://schemas.microsoft.com/office/drawing/2016/5/10/chartex" xmlns:cx5="http://schemas.microsoft.com/office/drawing/2016/5/11/chartex" xmlns:cx6="http://schemas.microsoft.com/office/drawing/2016/5/12/chartex" xmlns:cx7="http://schemas.microsoft.com/office/drawing/2016/5/13/chartex" xmlns:cx8="http://schemas.microsoft.com/office/drawing/2016/5/14/chartex" xmlns:mc="http://schemas.openxmlformats.org/markup-compatibility/2006" xmlns:aink="http://schemas.microsoft.com/office/drawing/2016/ink" xmlns:am3d="http://schemas.microsoft.com/office/drawing/2017/model3d" xmlns:o="urn:schemas-microsoft-com:office:office" xmlns:oel="http://schemas.microsoft.com/office/2019/extlst" xmlns:r="http://schemas.openxmlformats.org/officeDocument/2006/relationships" xmlns:m="http://schemas.openxmlformats.org/officeDocument/2006/math" xmlns:v="urn:schemas-microsoft-com:vml" xmlns:wp14="http://schemas.microsoft.com/office/word/2010/wordprocessingDrawing" xmlns:wp="http://schemas.openxmlformats.org/drawingml/2006/wordprocessingDrawing" xmlns:w10="urn:schemas-microsoft-com:office:word" xmlns:w="http://schemas.openxmlformats.org/wordprocessingml/2006/main" xmlns:w14="http://schemas.microsoft.com/office/word/2010/wordml" xmlns:w15="http://schemas.microsoft.com/office/word/2012/wordml" xmlns:w16cei="http://schemas.microsoft.com/office/word/2026/wordml/cei" xmlns:w16cex="http://schemas.microsoft.com/office/word/2018/wordml/cex" xmlns:w16cid="http://schemas.microsoft.com/office/word/2016/wordml/cid" xmlns:w16="http://schemas.microsoft.com/office/word/2018/wordml" xmlns:w16du="http://schemas.microsoft.com/office/word/2023/wordml/word16du" xmlns:w16sdtdh="http://schemas.microsoft.com/office/word/2020/wordml/sdtdatahash" xmlns:w16sdtfl="http://schemas.microsoft.com/office/word/2024/wordml/sdtformatlock" xmlns:w16se="http://schemas.microsoft.com/office/word/2015/wordml/symex" xmlns:wpg="http://schemas.microsoft.com/office/word/2010/wordprocessingGroup" xmlns:wpi="http://schemas.microsoft.com/office/word/2010/wordprocessingInk" xmlns:wne="http://schemas.microsoft.com/office/word/2006/wordml" xmlns:wps="http://schemas.microsoft.com/office/word/2010/wordprocessingShape" mc:Ignorable="w14 w15 w16se w16cid w16 w16cex w16sdtdh w16sdtfl w16du wp14">
+<w:footnotes xmlns:wpc="http://schemas.microsoft.com/office/word/2010/wordprocessingCanvas" xmlns:cx="http://schemas.microsoft.com/office/drawing/2014/chartex" xmlns:cx1="http://schemas.microsoft.com/office/drawing/2015/9/8/chartex" xmlns:cx2="http://schemas.microsoft.com/office/drawing/2015/10/21/chartex" xmlns:cx3="http://schemas.microsoft.com/office/drawing/2016/5/9/chartex" xmlns:cx4="http://schemas.microsoft.com/office/drawing/2016/5/10/chartex" xmlns:cx5="http://schemas.microsoft.com/office/drawing/2016/5/11/chartex" xmlns:cx6="http://schemas.microsoft.com/office/drawing/2016/5/12/chartex" xmlns:cx7="http://schemas.microsoft.com/office/drawing/2016/5/13/chartex" xmlns:cx8="http://schemas.microsoft.com/office/drawing/2016/5/14/chartex" xmlns:mc="http://schemas.openxmlformats.org/markup-compatibility/2006" xmlns:aink="http://schemas.microsoft.com/office/drawing/2016/ink" xmlns:am3d="http://schemas.microsoft.com/office/drawing/2017/model3d" xmlns:o="urn:schemas-microsoft-com:office:office" xmlns:oel="http://schemas.microsoft.com/office/2019/extlst" xmlns:r="http://schemas.openxmlformats.org/officeDocument/2006/relationships" xmlns:m="http://schemas.openxmlformats.org/officeDocument/2006/math" xmlns:v="urn:schemas-microsoft-com:vml" xmlns:wp14="http://schemas.microsoft.com/office/word/2010/wordprocessingDrawing" xmlns:wp="http://schemas.openxmlformats.org/drawingml/2006/wordprocessingDrawing" xmlns:w10="urn:schemas-microsoft-com:office:word" xmlns:w="http://schemas.openxmlformats.org/wordprocessingml/2006/main" xmlns:w14="http://schemas.microsoft.com/office/word/2010/wordml" xmlns:w15="http://schemas.microsoft.com/office/word/2012/wordml" xmlns:w16cex="http://schemas.microsoft.com/office/word/2018/wordml/cex" xmlns:w16cid="http://schemas.microsoft.com/office/word/2016/wordml/cid" xmlns:w16="http://schemas.microsoft.com/office/word/2018/wordml" xmlns:w16du="http://schemas.microsoft.com/office/word/2023/wordml/word16du" xmlns:w16sdtdh="http://schemas.microsoft.com/office/word/2020/wordml/sdtdatahash" xmlns:w16sdtfl="http://schemas.microsoft.com/office/word/2024/wordml/sdtformatlock" xmlns:w16se="http://schemas.microsoft.com/office/word/2015/wordml/symex" xmlns:wpg="http://schemas.microsoft.com/office/word/2010/wordprocessingGroup" xmlns:wpi="http://schemas.microsoft.com/office/word/2010/wordprocessingInk" xmlns:wne="http://schemas.microsoft.com/office/word/2006/wordml" xmlns:wps="http://schemas.microsoft.com/office/word/2010/wordprocessingShape" mc:Ignorable="w14 w15 w16se w16cid w16 w16cex w16sdtdh w16sdtfl w16du wp14">
   <w:footnote w:type="separator" w:id="-1">
     <w:p>
       <w:pPr>
@@ -4918,7 +4322,7 @@
 </file>
 
 <file path=word/header1.xml><?xml version="1.0" encoding="utf-8"?>
-<w:hdr xmlns:wpc="http://schemas.microsoft.com/office/word/2010/wordprocessingCanvas" xmlns:cx="http://schemas.microsoft.com/office/drawing/2014/chartex" xmlns:cx1="http://schemas.microsoft.com/office/drawing/2015/9/8/chartex" xmlns:cx2="http://schemas.microsoft.com/office/drawing/2015/10/21/chartex" xmlns:cx3="http://schemas.microsoft.com/office/drawing/2016/5/9/chartex" xmlns:cx4="http://schemas.microsoft.com/office/drawing/2016/5/10/chartex" xmlns:cx5="http://schemas.microsoft.com/office/drawing/2016/5/11/chartex" xmlns:cx6="http://schemas.microsoft.com/office/drawing/2016/5/12/chartex" xmlns:cx7="http://schemas.microsoft.com/office/drawing/2016/5/13/chartex" xmlns:cx8="http://schemas.microsoft.com/office/drawing/2016/5/14/chartex" xmlns:mc="http://schemas.openxmlformats.org/markup-compatibility/2006" xmlns:aink="http://schemas.microsoft.com/office/drawing/2016/ink" xmlns:am3d="http://schemas.microsoft.com/office/drawing/2017/model3d" xmlns:o="urn:schemas-microsoft-com:office:office" xmlns:oel="http://schemas.microsoft.com/office/2019/extlst" xmlns:r="http://schemas.openxmlformats.org/officeDocument/2006/relationships" xmlns:m="http://schemas.openxmlformats.org/officeDocument/2006/math" xmlns:v="urn:schemas-microsoft-com:vml" xmlns:wp14="http://schemas.microsoft.com/office/word/2010/wordprocessingDrawing" xmlns:wp="http://schemas.openxmlformats.org/drawingml/2006/wordprocessingDrawing" xmlns:w10="urn:schemas-microsoft-com:office:word" xmlns:w="http://schemas.openxmlformats.org/wordprocessingml/2006/main" xmlns:w14="http://schemas.microsoft.com/office/word/2010/wordml" xmlns:w15="http://schemas.microsoft.com/office/word/2012/wordml" xmlns:w16cei="http://schemas.microsoft.com/office/word/2026/wordml/cei" xmlns:w16cex="http://schemas.microsoft.com/office/word/2018/wordml/cex" xmlns:w16cid="http://schemas.microsoft.com/office/word/2016/wordml/cid" xmlns:w16="http://schemas.microsoft.com/office/word/2018/wordml" xmlns:w16du="http://schemas.microsoft.com/office/word/2023/wordml/word16du" xmlns:w16sdtdh="http://schemas.microsoft.com/office/word/2020/wordml/sdtdatahash" xmlns:w16sdtfl="http://schemas.microsoft.com/office/word/2024/wordml/sdtformatlock" xmlns:w16se="http://schemas.microsoft.com/office/word/2015/wordml/symex" xmlns:wpg="http://schemas.microsoft.com/office/word/2010/wordprocessingGroup" xmlns:wpi="http://schemas.microsoft.com/office/word/2010/wordprocessingInk" xmlns:wne="http://schemas.microsoft.com/office/word/2006/wordml" xmlns:wps="http://schemas.microsoft.com/office/word/2010/wordprocessingShape" mc:Ignorable="w14 w15 w16se w16cid w16 w16cex w16sdtdh w16sdtfl w16du wp14">
+<w:hdr xmlns:wpc="http://schemas.microsoft.com/office/word/2010/wordprocessingCanvas" xmlns:cx="http://schemas.microsoft.com/office/drawing/2014/chartex" xmlns:cx1="http://schemas.microsoft.com/office/drawing/2015/9/8/chartex" xmlns:cx2="http://schemas.microsoft.com/office/drawing/2015/10/21/chartex" xmlns:cx3="http://schemas.microsoft.com/office/drawing/2016/5/9/chartex" xmlns:cx4="http://schemas.microsoft.com/office/drawing/2016/5/10/chartex" xmlns:cx5="http://schemas.microsoft.com/office/drawing/2016/5/11/chartex" xmlns:cx6="http://schemas.microsoft.com/office/drawing/2016/5/12/chartex" xmlns:cx7="http://schemas.microsoft.com/office/drawing/2016/5/13/chartex" xmlns:cx8="http://schemas.microsoft.com/office/drawing/2016/5/14/chartex" xmlns:mc="http://schemas.openxmlformats.org/markup-compatibility/2006" xmlns:aink="http://schemas.microsoft.com/office/drawing/2016/ink" xmlns:am3d="http://schemas.microsoft.com/office/drawing/2017/model3d" xmlns:o="urn:schemas-microsoft-com:office:office" xmlns:oel="http://schemas.microsoft.com/office/2019/extlst" xmlns:r="http://schemas.openxmlformats.org/officeDocument/2006/relationships" xmlns:m="http://schemas.openxmlformats.org/officeDocument/2006/math" xmlns:v="urn:schemas-microsoft-com:vml" xmlns:wp14="http://schemas.microsoft.com/office/word/2010/wordprocessingDrawing" xmlns:wp="http://schemas.openxmlformats.org/drawingml/2006/wordprocessingDrawing" xmlns:w10="urn:schemas-microsoft-com:office:word" xmlns:w="http://schemas.openxmlformats.org/wordprocessingml/2006/main" xmlns:w14="http://schemas.microsoft.com/office/word/2010/wordml" xmlns:w15="http://schemas.microsoft.com/office/word/2012/wordml" xmlns:w16cex="http://schemas.microsoft.com/office/word/2018/wordml/cex" xmlns:w16cid="http://schemas.microsoft.com/office/word/2016/wordml/cid" xmlns:w16="http://schemas.microsoft.com/office/word/2018/wordml" xmlns:w16du="http://schemas.microsoft.com/office/word/2023/wordml/word16du" xmlns:w16sdtdh="http://schemas.microsoft.com/office/word/2020/wordml/sdtdatahash" xmlns:w16sdtfl="http://schemas.microsoft.com/office/word/2024/wordml/sdtformatlock" xmlns:w16se="http://schemas.microsoft.com/office/word/2015/wordml/symex" xmlns:wpg="http://schemas.microsoft.com/office/word/2010/wordprocessingGroup" xmlns:wpi="http://schemas.microsoft.com/office/word/2010/wordprocessingInk" xmlns:wne="http://schemas.microsoft.com/office/word/2006/wordml" xmlns:wps="http://schemas.microsoft.com/office/word/2010/wordprocessingShape" mc:Ignorable="w14 w15 w16se w16cid w16 w16cex w16sdtdh w16sdtfl w16du wp14">
   <w:p>
     <w:pPr>
       <w:pStyle w:val="Cabealho"/>
@@ -4930,32 +4334,14 @@
         <w:color w:val="5F6368"/>
         <w:sz w:val="17"/>
       </w:rPr>
-      <w:t xml:space="preserve">PROPOSTA </w:t>
-    </w:r>
-    <w:proofErr w:type="gramStart"/>
-    <w:r>
-      <w:rPr>
-        <w:b/>
-        <w:color w:val="5F6368"/>
-        <w:sz w:val="17"/>
-      </w:rPr>
-      <w:t>TÉCNICA  |</w:t>
-    </w:r>
-    <w:proofErr w:type="gramEnd"/>
-    <w:r>
-      <w:rPr>
-        <w:b/>
-        <w:color w:val="5F6368"/>
-        <w:sz w:val="17"/>
-      </w:rPr>
-      <w:t xml:space="preserve">  PORTAL MOVE.ON</w:t>
+      <w:t>PROPOSTA TÉCNICA  |  PORTAL MOVE.ON</w:t>
     </w:r>
   </w:p>
 </w:hdr>
 </file>
 
 <file path=word/numbering.xml><?xml version="1.0" encoding="utf-8"?>
-<w:numbering xmlns:wpc="http://schemas.microsoft.com/office/word/2010/wordprocessingCanvas" xmlns:cx="http://schemas.microsoft.com/office/drawing/2014/chartex" xmlns:cx1="http://schemas.microsoft.com/office/drawing/2015/9/8/chartex" xmlns:cx2="http://schemas.microsoft.com/office/drawing/2015/10/21/chartex" xmlns:cx3="http://schemas.microsoft.com/office/drawing/2016/5/9/chartex" xmlns:cx4="http://schemas.microsoft.com/office/drawing/2016/5/10/chartex" xmlns:cx5="http://schemas.microsoft.com/office/drawing/2016/5/11/chartex" xmlns:cx6="http://schemas.microsoft.com/office/drawing/2016/5/12/chartex" xmlns:cx7="http://schemas.microsoft.com/office/drawing/2016/5/13/chartex" xmlns:cx8="http://schemas.microsoft.com/office/drawing/2016/5/14/chartex" xmlns:mc="http://schemas.openxmlformats.org/markup-compatibility/2006" xmlns:aink="http://schemas.microsoft.com/office/drawing/2016/ink" xmlns:am3d="http://schemas.microsoft.com/office/drawing/2017/model3d" xmlns:o="urn:schemas-microsoft-com:office:office" xmlns:oel="http://schemas.microsoft.com/office/2019/extlst" xmlns:r="http://schemas.openxmlformats.org/officeDocument/2006/relationships" xmlns:m="http://schemas.openxmlformats.org/officeDocument/2006/math" xmlns:v="urn:schemas-microsoft-com:vml" xmlns:wp14="http://schemas.microsoft.com/office/word/2010/wordprocessingDrawing" xmlns:wp="http://schemas.openxmlformats.org/drawingml/2006/wordprocessingDrawing" xmlns:w10="urn:schemas-microsoft-com:office:word" xmlns:w="http://schemas.openxmlformats.org/wordprocessingml/2006/main" xmlns:w14="http://schemas.microsoft.com/office/word/2010/wordml" xmlns:w15="http://schemas.microsoft.com/office/word/2012/wordml" xmlns:w16cei="http://schemas.microsoft.com/office/word/2026/wordml/cei" xmlns:w16cex="http://schemas.microsoft.com/office/word/2018/wordml/cex" xmlns:w16cid="http://schemas.microsoft.com/office/word/2016/wordml/cid" xmlns:w16="http://schemas.microsoft.com/office/word/2018/wordml" xmlns:w16du="http://schemas.microsoft.com/office/word/2023/wordml/word16du" xmlns:w16sdtdh="http://schemas.microsoft.com/office/word/2020/wordml/sdtdatahash" xmlns:w16sdtfl="http://schemas.microsoft.com/office/word/2024/wordml/sdtformatlock" xmlns:w16se="http://schemas.microsoft.com/office/word/2015/wordml/symex" xmlns:wpg="http://schemas.microsoft.com/office/word/2010/wordprocessingGroup" xmlns:wpi="http://schemas.microsoft.com/office/word/2010/wordprocessingInk" xmlns:wne="http://schemas.microsoft.com/office/word/2006/wordml" xmlns:wps="http://schemas.microsoft.com/office/word/2010/wordprocessingShape" mc:Ignorable="w14 w15 w16se w16cid w16 w16cex w16sdtdh w16sdtfl w16du wp14">
+<w:numbering xmlns:wpc="http://schemas.microsoft.com/office/word/2010/wordprocessingCanvas" xmlns:cx="http://schemas.microsoft.com/office/drawing/2014/chartex" xmlns:cx1="http://schemas.microsoft.com/office/drawing/2015/9/8/chartex" xmlns:cx2="http://schemas.microsoft.com/office/drawing/2015/10/21/chartex" xmlns:cx3="http://schemas.microsoft.com/office/drawing/2016/5/9/chartex" xmlns:cx4="http://schemas.microsoft.com/office/drawing/2016/5/10/chartex" xmlns:cx5="http://schemas.microsoft.com/office/drawing/2016/5/11/chartex" xmlns:cx6="http://schemas.microsoft.com/office/drawing/2016/5/12/chartex" xmlns:cx7="http://schemas.microsoft.com/office/drawing/2016/5/13/chartex" xmlns:cx8="http://schemas.microsoft.com/office/drawing/2016/5/14/chartex" xmlns:mc="http://schemas.openxmlformats.org/markup-compatibility/2006" xmlns:aink="http://schemas.microsoft.com/office/drawing/2016/ink" xmlns:am3d="http://schemas.microsoft.com/office/drawing/2017/model3d" xmlns:o="urn:schemas-microsoft-com:office:office" xmlns:oel="http://schemas.microsoft.com/office/2019/extlst" xmlns:r="http://schemas.openxmlformats.org/officeDocument/2006/relationships" xmlns:m="http://schemas.openxmlformats.org/officeDocument/2006/math" xmlns:v="urn:schemas-microsoft-com:vml" xmlns:wp14="http://schemas.microsoft.com/office/word/2010/wordprocessingDrawing" xmlns:wp="http://schemas.openxmlformats.org/drawingml/2006/wordprocessingDrawing" xmlns:w10="urn:schemas-microsoft-com:office:word" xmlns:w="http://schemas.openxmlformats.org/wordprocessingml/2006/main" xmlns:w14="http://schemas.microsoft.com/office/word/2010/wordml" xmlns:w15="http://schemas.microsoft.com/office/word/2012/wordml" xmlns:w16cex="http://schemas.microsoft.com/office/word/2018/wordml/cex" xmlns:w16cid="http://schemas.microsoft.com/office/word/2016/wordml/cid" xmlns:w16="http://schemas.microsoft.com/office/word/2018/wordml" xmlns:w16du="http://schemas.microsoft.com/office/word/2023/wordml/word16du" xmlns:w16sdtdh="http://schemas.microsoft.com/office/word/2020/wordml/sdtdatahash" xmlns:w16sdtfl="http://schemas.microsoft.com/office/word/2024/wordml/sdtformatlock" xmlns:w16se="http://schemas.microsoft.com/office/word/2015/wordml/symex" xmlns:wpg="http://schemas.microsoft.com/office/word/2010/wordprocessingGroup" xmlns:wpi="http://schemas.microsoft.com/office/word/2010/wordprocessingInk" xmlns:wne="http://schemas.microsoft.com/office/word/2006/wordml" xmlns:wps="http://schemas.microsoft.com/office/word/2010/wordprocessingShape" mc:Ignorable="w14 w15 w16se w16cid w16 w16cex w16sdtdh w16sdtfl w16du wp14">
   <w:abstractNum w:abstractNumId="0" w15:restartNumberingAfterBreak="0">
     <w:nsid w:val="FFFFFF7C"/>
     <w:multiLevelType w:val="singleLevel"/>
@@ -5091,7 +4477,7 @@
   <w:abstractNum w:abstractNumId="7" w15:restartNumberingAfterBreak="0">
     <w:nsid w:val="FFFFFF88"/>
     <w:multiLevelType w:val="singleLevel"/>
-    <w:tmpl w:val="D0A62B40"/>
+    <w:tmpl w:val="358E00C4"/>
     <w:lvl w:ilvl="0">
       <w:start w:val="1"/>
       <w:numFmt w:val="decimal"/>
@@ -5109,7 +4495,7 @@
   <w:abstractNum w:abstractNumId="8" w15:restartNumberingAfterBreak="0">
     <w:nsid w:val="FFFFFF89"/>
     <w:multiLevelType w:val="singleLevel"/>
-    <w:tmpl w:val="29761A62"/>
+    <w:tmpl w:val="861A3018"/>
     <w:lvl w:ilvl="0">
       <w:start w:val="1"/>
       <w:numFmt w:val="bullet"/>
@@ -5124,6 +4510,570 @@
       </w:pPr>
       <w:rPr>
         <w:rFonts w:ascii="Symbol" w:hAnsi="Symbol" w:hint="default"/>
+      </w:rPr>
+    </w:lvl>
+  </w:abstractNum>
+  <w:abstractNum w:abstractNumId="9" w15:restartNumberingAfterBreak="0">
+    <w:nsid w:val="0FE207CC"/>
+    <w:multiLevelType w:val="hybridMultilevel"/>
+    <w:tmpl w:val="B702432A"/>
+    <w:lvl w:ilvl="0" w:tplc="04160001">
+      <w:start w:val="1"/>
+      <w:numFmt w:val="bullet"/>
+      <w:lvlText w:val=""/>
+      <w:lvlJc w:val="left"/>
+      <w:pPr>
+        <w:ind w:left="1428" w:hanging="360"/>
+      </w:pPr>
+      <w:rPr>
+        <w:rFonts w:ascii="Symbol" w:hAnsi="Symbol" w:hint="default"/>
+      </w:rPr>
+    </w:lvl>
+    <w:lvl w:ilvl="1" w:tplc="04160003" w:tentative="1">
+      <w:start w:val="1"/>
+      <w:numFmt w:val="bullet"/>
+      <w:lvlText w:val="o"/>
+      <w:lvlJc w:val="left"/>
+      <w:pPr>
+        <w:ind w:left="2148" w:hanging="360"/>
+      </w:pPr>
+      <w:rPr>
+        <w:rFonts w:ascii="Courier New" w:hAnsi="Courier New" w:cs="Courier New" w:hint="default"/>
+      </w:rPr>
+    </w:lvl>
+    <w:lvl w:ilvl="2" w:tplc="04160005" w:tentative="1">
+      <w:start w:val="1"/>
+      <w:numFmt w:val="bullet"/>
+      <w:lvlText w:val=""/>
+      <w:lvlJc w:val="left"/>
+      <w:pPr>
+        <w:ind w:left="2868" w:hanging="360"/>
+      </w:pPr>
+      <w:rPr>
+        <w:rFonts w:ascii="Wingdings" w:hAnsi="Wingdings" w:hint="default"/>
+      </w:rPr>
+    </w:lvl>
+    <w:lvl w:ilvl="3" w:tplc="04160001" w:tentative="1">
+      <w:start w:val="1"/>
+      <w:numFmt w:val="bullet"/>
+      <w:lvlText w:val=""/>
+      <w:lvlJc w:val="left"/>
+      <w:pPr>
+        <w:ind w:left="3588" w:hanging="360"/>
+      </w:pPr>
+      <w:rPr>
+        <w:rFonts w:ascii="Symbol" w:hAnsi="Symbol" w:hint="default"/>
+      </w:rPr>
+    </w:lvl>
+    <w:lvl w:ilvl="4" w:tplc="04160003" w:tentative="1">
+      <w:start w:val="1"/>
+      <w:numFmt w:val="bullet"/>
+      <w:lvlText w:val="o"/>
+      <w:lvlJc w:val="left"/>
+      <w:pPr>
+        <w:ind w:left="4308" w:hanging="360"/>
+      </w:pPr>
+      <w:rPr>
+        <w:rFonts w:ascii="Courier New" w:hAnsi="Courier New" w:cs="Courier New" w:hint="default"/>
+      </w:rPr>
+    </w:lvl>
+    <w:lvl w:ilvl="5" w:tplc="04160005" w:tentative="1">
+      <w:start w:val="1"/>
+      <w:numFmt w:val="bullet"/>
+      <w:lvlText w:val=""/>
+      <w:lvlJc w:val="left"/>
+      <w:pPr>
+        <w:ind w:left="5028" w:hanging="360"/>
+      </w:pPr>
+      <w:rPr>
+        <w:rFonts w:ascii="Wingdings" w:hAnsi="Wingdings" w:hint="default"/>
+      </w:rPr>
+    </w:lvl>
+    <w:lvl w:ilvl="6" w:tplc="04160001" w:tentative="1">
+      <w:start w:val="1"/>
+      <w:numFmt w:val="bullet"/>
+      <w:lvlText w:val=""/>
+      <w:lvlJc w:val="left"/>
+      <w:pPr>
+        <w:ind w:left="5748" w:hanging="360"/>
+      </w:pPr>
+      <w:rPr>
+        <w:rFonts w:ascii="Symbol" w:hAnsi="Symbol" w:hint="default"/>
+      </w:rPr>
+    </w:lvl>
+    <w:lvl w:ilvl="7" w:tplc="04160003" w:tentative="1">
+      <w:start w:val="1"/>
+      <w:numFmt w:val="bullet"/>
+      <w:lvlText w:val="o"/>
+      <w:lvlJc w:val="left"/>
+      <w:pPr>
+        <w:ind w:left="6468" w:hanging="360"/>
+      </w:pPr>
+      <w:rPr>
+        <w:rFonts w:ascii="Courier New" w:hAnsi="Courier New" w:cs="Courier New" w:hint="default"/>
+      </w:rPr>
+    </w:lvl>
+    <w:lvl w:ilvl="8" w:tplc="04160005" w:tentative="1">
+      <w:start w:val="1"/>
+      <w:numFmt w:val="bullet"/>
+      <w:lvlText w:val=""/>
+      <w:lvlJc w:val="left"/>
+      <w:pPr>
+        <w:ind w:left="7188" w:hanging="360"/>
+      </w:pPr>
+      <w:rPr>
+        <w:rFonts w:ascii="Wingdings" w:hAnsi="Wingdings" w:hint="default"/>
+      </w:rPr>
+    </w:lvl>
+  </w:abstractNum>
+  <w:abstractNum w:abstractNumId="10" w15:restartNumberingAfterBreak="0">
+    <w:nsid w:val="3CFA082A"/>
+    <w:multiLevelType w:val="hybridMultilevel"/>
+    <w:tmpl w:val="E87C6412"/>
+    <w:lvl w:ilvl="0" w:tplc="04160001">
+      <w:start w:val="1"/>
+      <w:numFmt w:val="bullet"/>
+      <w:lvlText w:val=""/>
+      <w:lvlJc w:val="left"/>
+      <w:pPr>
+        <w:ind w:left="1428" w:hanging="360"/>
+      </w:pPr>
+      <w:rPr>
+        <w:rFonts w:ascii="Symbol" w:hAnsi="Symbol" w:hint="default"/>
+      </w:rPr>
+    </w:lvl>
+    <w:lvl w:ilvl="1" w:tplc="04160003" w:tentative="1">
+      <w:start w:val="1"/>
+      <w:numFmt w:val="bullet"/>
+      <w:lvlText w:val="o"/>
+      <w:lvlJc w:val="left"/>
+      <w:pPr>
+        <w:ind w:left="2148" w:hanging="360"/>
+      </w:pPr>
+      <w:rPr>
+        <w:rFonts w:ascii="Courier New" w:hAnsi="Courier New" w:cs="Courier New" w:hint="default"/>
+      </w:rPr>
+    </w:lvl>
+    <w:lvl w:ilvl="2" w:tplc="04160005" w:tentative="1">
+      <w:start w:val="1"/>
+      <w:numFmt w:val="bullet"/>
+      <w:lvlText w:val=""/>
+      <w:lvlJc w:val="left"/>
+      <w:pPr>
+        <w:ind w:left="2868" w:hanging="360"/>
+      </w:pPr>
+      <w:rPr>
+        <w:rFonts w:ascii="Wingdings" w:hAnsi="Wingdings" w:hint="default"/>
+      </w:rPr>
+    </w:lvl>
+    <w:lvl w:ilvl="3" w:tplc="04160001" w:tentative="1">
+      <w:start w:val="1"/>
+      <w:numFmt w:val="bullet"/>
+      <w:lvlText w:val=""/>
+      <w:lvlJc w:val="left"/>
+      <w:pPr>
+        <w:ind w:left="3588" w:hanging="360"/>
+      </w:pPr>
+      <w:rPr>
+        <w:rFonts w:ascii="Symbol" w:hAnsi="Symbol" w:hint="default"/>
+      </w:rPr>
+    </w:lvl>
+    <w:lvl w:ilvl="4" w:tplc="04160003" w:tentative="1">
+      <w:start w:val="1"/>
+      <w:numFmt w:val="bullet"/>
+      <w:lvlText w:val="o"/>
+      <w:lvlJc w:val="left"/>
+      <w:pPr>
+        <w:ind w:left="4308" w:hanging="360"/>
+      </w:pPr>
+      <w:rPr>
+        <w:rFonts w:ascii="Courier New" w:hAnsi="Courier New" w:cs="Courier New" w:hint="default"/>
+      </w:rPr>
+    </w:lvl>
+    <w:lvl w:ilvl="5" w:tplc="04160005" w:tentative="1">
+      <w:start w:val="1"/>
+      <w:numFmt w:val="bullet"/>
+      <w:lvlText w:val=""/>
+      <w:lvlJc w:val="left"/>
+      <w:pPr>
+        <w:ind w:left="5028" w:hanging="360"/>
+      </w:pPr>
+      <w:rPr>
+        <w:rFonts w:ascii="Wingdings" w:hAnsi="Wingdings" w:hint="default"/>
+      </w:rPr>
+    </w:lvl>
+    <w:lvl w:ilvl="6" w:tplc="04160001" w:tentative="1">
+      <w:start w:val="1"/>
+      <w:numFmt w:val="bullet"/>
+      <w:lvlText w:val=""/>
+      <w:lvlJc w:val="left"/>
+      <w:pPr>
+        <w:ind w:left="5748" w:hanging="360"/>
+      </w:pPr>
+      <w:rPr>
+        <w:rFonts w:ascii="Symbol" w:hAnsi="Symbol" w:hint="default"/>
+      </w:rPr>
+    </w:lvl>
+    <w:lvl w:ilvl="7" w:tplc="04160003" w:tentative="1">
+      <w:start w:val="1"/>
+      <w:numFmt w:val="bullet"/>
+      <w:lvlText w:val="o"/>
+      <w:lvlJc w:val="left"/>
+      <w:pPr>
+        <w:ind w:left="6468" w:hanging="360"/>
+      </w:pPr>
+      <w:rPr>
+        <w:rFonts w:ascii="Courier New" w:hAnsi="Courier New" w:cs="Courier New" w:hint="default"/>
+      </w:rPr>
+    </w:lvl>
+    <w:lvl w:ilvl="8" w:tplc="04160005" w:tentative="1">
+      <w:start w:val="1"/>
+      <w:numFmt w:val="bullet"/>
+      <w:lvlText w:val=""/>
+      <w:lvlJc w:val="left"/>
+      <w:pPr>
+        <w:ind w:left="7188" w:hanging="360"/>
+      </w:pPr>
+      <w:rPr>
+        <w:rFonts w:ascii="Wingdings" w:hAnsi="Wingdings" w:hint="default"/>
+      </w:rPr>
+    </w:lvl>
+  </w:abstractNum>
+  <w:abstractNum w:abstractNumId="11" w15:restartNumberingAfterBreak="0">
+    <w:nsid w:val="42265B08"/>
+    <w:multiLevelType w:val="hybridMultilevel"/>
+    <w:tmpl w:val="EE2CD61C"/>
+    <w:lvl w:ilvl="0" w:tplc="4AD2F080">
+      <w:numFmt w:val="bullet"/>
+      <w:lvlText w:val="-"/>
+      <w:lvlJc w:val="left"/>
+      <w:pPr>
+        <w:ind w:left="720" w:hanging="360"/>
+      </w:pPr>
+      <w:rPr>
+        <w:rFonts w:ascii="Montserrat" w:eastAsiaTheme="minorEastAsia" w:hAnsi="Montserrat" w:cstheme="minorBidi" w:hint="default"/>
+      </w:rPr>
+    </w:lvl>
+    <w:lvl w:ilvl="1" w:tplc="04160003" w:tentative="1">
+      <w:start w:val="1"/>
+      <w:numFmt w:val="bullet"/>
+      <w:lvlText w:val="o"/>
+      <w:lvlJc w:val="left"/>
+      <w:pPr>
+        <w:ind w:left="1440" w:hanging="360"/>
+      </w:pPr>
+      <w:rPr>
+        <w:rFonts w:ascii="Courier New" w:hAnsi="Courier New" w:cs="Courier New" w:hint="default"/>
+      </w:rPr>
+    </w:lvl>
+    <w:lvl w:ilvl="2" w:tplc="04160005" w:tentative="1">
+      <w:start w:val="1"/>
+      <w:numFmt w:val="bullet"/>
+      <w:lvlText w:val=""/>
+      <w:lvlJc w:val="left"/>
+      <w:pPr>
+        <w:ind w:left="2160" w:hanging="360"/>
+      </w:pPr>
+      <w:rPr>
+        <w:rFonts w:ascii="Wingdings" w:hAnsi="Wingdings" w:hint="default"/>
+      </w:rPr>
+    </w:lvl>
+    <w:lvl w:ilvl="3" w:tplc="04160001" w:tentative="1">
+      <w:start w:val="1"/>
+      <w:numFmt w:val="bullet"/>
+      <w:lvlText w:val=""/>
+      <w:lvlJc w:val="left"/>
+      <w:pPr>
+        <w:ind w:left="2880" w:hanging="360"/>
+      </w:pPr>
+      <w:rPr>
+        <w:rFonts w:ascii="Symbol" w:hAnsi="Symbol" w:hint="default"/>
+      </w:rPr>
+    </w:lvl>
+    <w:lvl w:ilvl="4" w:tplc="04160003" w:tentative="1">
+      <w:start w:val="1"/>
+      <w:numFmt w:val="bullet"/>
+      <w:lvlText w:val="o"/>
+      <w:lvlJc w:val="left"/>
+      <w:pPr>
+        <w:ind w:left="3600" w:hanging="360"/>
+      </w:pPr>
+      <w:rPr>
+        <w:rFonts w:ascii="Courier New" w:hAnsi="Courier New" w:cs="Courier New" w:hint="default"/>
+      </w:rPr>
+    </w:lvl>
+    <w:lvl w:ilvl="5" w:tplc="04160005" w:tentative="1">
+      <w:start w:val="1"/>
+      <w:numFmt w:val="bullet"/>
+      <w:lvlText w:val=""/>
+      <w:lvlJc w:val="left"/>
+      <w:pPr>
+        <w:ind w:left="4320" w:hanging="360"/>
+      </w:pPr>
+      <w:rPr>
+        <w:rFonts w:ascii="Wingdings" w:hAnsi="Wingdings" w:hint="default"/>
+      </w:rPr>
+    </w:lvl>
+    <w:lvl w:ilvl="6" w:tplc="04160001" w:tentative="1">
+      <w:start w:val="1"/>
+      <w:numFmt w:val="bullet"/>
+      <w:lvlText w:val=""/>
+      <w:lvlJc w:val="left"/>
+      <w:pPr>
+        <w:ind w:left="5040" w:hanging="360"/>
+      </w:pPr>
+      <w:rPr>
+        <w:rFonts w:ascii="Symbol" w:hAnsi="Symbol" w:hint="default"/>
+      </w:rPr>
+    </w:lvl>
+    <w:lvl w:ilvl="7" w:tplc="04160003" w:tentative="1">
+      <w:start w:val="1"/>
+      <w:numFmt w:val="bullet"/>
+      <w:lvlText w:val="o"/>
+      <w:lvlJc w:val="left"/>
+      <w:pPr>
+        <w:ind w:left="5760" w:hanging="360"/>
+      </w:pPr>
+      <w:rPr>
+        <w:rFonts w:ascii="Courier New" w:hAnsi="Courier New" w:cs="Courier New" w:hint="default"/>
+      </w:rPr>
+    </w:lvl>
+    <w:lvl w:ilvl="8" w:tplc="04160005" w:tentative="1">
+      <w:start w:val="1"/>
+      <w:numFmt w:val="bullet"/>
+      <w:lvlText w:val=""/>
+      <w:lvlJc w:val="left"/>
+      <w:pPr>
+        <w:ind w:left="6480" w:hanging="360"/>
+      </w:pPr>
+      <w:rPr>
+        <w:rFonts w:ascii="Wingdings" w:hAnsi="Wingdings" w:hint="default"/>
+      </w:rPr>
+    </w:lvl>
+  </w:abstractNum>
+  <w:abstractNum w:abstractNumId="12" w15:restartNumberingAfterBreak="0">
+    <w:nsid w:val="70327A05"/>
+    <w:multiLevelType w:val="hybridMultilevel"/>
+    <w:tmpl w:val="E9E6A206"/>
+    <w:lvl w:ilvl="0" w:tplc="04160001">
+      <w:start w:val="1"/>
+      <w:numFmt w:val="bullet"/>
+      <w:lvlText w:val=""/>
+      <w:lvlJc w:val="left"/>
+      <w:pPr>
+        <w:ind w:left="1428" w:hanging="360"/>
+      </w:pPr>
+      <w:rPr>
+        <w:rFonts w:ascii="Symbol" w:hAnsi="Symbol" w:hint="default"/>
+      </w:rPr>
+    </w:lvl>
+    <w:lvl w:ilvl="1" w:tplc="04160003" w:tentative="1">
+      <w:start w:val="1"/>
+      <w:numFmt w:val="bullet"/>
+      <w:lvlText w:val="o"/>
+      <w:lvlJc w:val="left"/>
+      <w:pPr>
+        <w:ind w:left="2148" w:hanging="360"/>
+      </w:pPr>
+      <w:rPr>
+        <w:rFonts w:ascii="Courier New" w:hAnsi="Courier New" w:cs="Courier New" w:hint="default"/>
+      </w:rPr>
+    </w:lvl>
+    <w:lvl w:ilvl="2" w:tplc="04160005" w:tentative="1">
+      <w:start w:val="1"/>
+      <w:numFmt w:val="bullet"/>
+      <w:lvlText w:val=""/>
+      <w:lvlJc w:val="left"/>
+      <w:pPr>
+        <w:ind w:left="2868" w:hanging="360"/>
+      </w:pPr>
+      <w:rPr>
+        <w:rFonts w:ascii="Wingdings" w:hAnsi="Wingdings" w:hint="default"/>
+      </w:rPr>
+    </w:lvl>
+    <w:lvl w:ilvl="3" w:tplc="04160001" w:tentative="1">
+      <w:start w:val="1"/>
+      <w:numFmt w:val="bullet"/>
+      <w:lvlText w:val=""/>
+      <w:lvlJc w:val="left"/>
+      <w:pPr>
+        <w:ind w:left="3588" w:hanging="360"/>
+      </w:pPr>
+      <w:rPr>
+        <w:rFonts w:ascii="Symbol" w:hAnsi="Symbol" w:hint="default"/>
+      </w:rPr>
+    </w:lvl>
+    <w:lvl w:ilvl="4" w:tplc="04160003" w:tentative="1">
+      <w:start w:val="1"/>
+      <w:numFmt w:val="bullet"/>
+      <w:lvlText w:val="o"/>
+      <w:lvlJc w:val="left"/>
+      <w:pPr>
+        <w:ind w:left="4308" w:hanging="360"/>
+      </w:pPr>
+      <w:rPr>
+        <w:rFonts w:ascii="Courier New" w:hAnsi="Courier New" w:cs="Courier New" w:hint="default"/>
+      </w:rPr>
+    </w:lvl>
+    <w:lvl w:ilvl="5" w:tplc="04160005" w:tentative="1">
+      <w:start w:val="1"/>
+      <w:numFmt w:val="bullet"/>
+      <w:lvlText w:val=""/>
+      <w:lvlJc w:val="left"/>
+      <w:pPr>
+        <w:ind w:left="5028" w:hanging="360"/>
+      </w:pPr>
+      <w:rPr>
+        <w:rFonts w:ascii="Wingdings" w:hAnsi="Wingdings" w:hint="default"/>
+      </w:rPr>
+    </w:lvl>
+    <w:lvl w:ilvl="6" w:tplc="04160001" w:tentative="1">
+      <w:start w:val="1"/>
+      <w:numFmt w:val="bullet"/>
+      <w:lvlText w:val=""/>
+      <w:lvlJc w:val="left"/>
+      <w:pPr>
+        <w:ind w:left="5748" w:hanging="360"/>
+      </w:pPr>
+      <w:rPr>
+        <w:rFonts w:ascii="Symbol" w:hAnsi="Symbol" w:hint="default"/>
+      </w:rPr>
+    </w:lvl>
+    <w:lvl w:ilvl="7" w:tplc="04160003" w:tentative="1">
+      <w:start w:val="1"/>
+      <w:numFmt w:val="bullet"/>
+      <w:lvlText w:val="o"/>
+      <w:lvlJc w:val="left"/>
+      <w:pPr>
+        <w:ind w:left="6468" w:hanging="360"/>
+      </w:pPr>
+      <w:rPr>
+        <w:rFonts w:ascii="Courier New" w:hAnsi="Courier New" w:cs="Courier New" w:hint="default"/>
+      </w:rPr>
+    </w:lvl>
+    <w:lvl w:ilvl="8" w:tplc="04160005" w:tentative="1">
+      <w:start w:val="1"/>
+      <w:numFmt w:val="bullet"/>
+      <w:lvlText w:val=""/>
+      <w:lvlJc w:val="left"/>
+      <w:pPr>
+        <w:ind w:left="7188" w:hanging="360"/>
+      </w:pPr>
+      <w:rPr>
+        <w:rFonts w:ascii="Wingdings" w:hAnsi="Wingdings" w:hint="default"/>
+      </w:rPr>
+    </w:lvl>
+  </w:abstractNum>
+  <w:abstractNum w:abstractNumId="13" w15:restartNumberingAfterBreak="0">
+    <w:nsid w:val="77154117"/>
+    <w:multiLevelType w:val="hybridMultilevel"/>
+    <w:tmpl w:val="A66AC20C"/>
+    <w:lvl w:ilvl="0" w:tplc="04160001">
+      <w:start w:val="1"/>
+      <w:numFmt w:val="bullet"/>
+      <w:lvlText w:val=""/>
+      <w:lvlJc w:val="left"/>
+      <w:pPr>
+        <w:ind w:left="1428" w:hanging="360"/>
+      </w:pPr>
+      <w:rPr>
+        <w:rFonts w:ascii="Symbol" w:hAnsi="Symbol" w:hint="default"/>
+      </w:rPr>
+    </w:lvl>
+    <w:lvl w:ilvl="1" w:tplc="04160003" w:tentative="1">
+      <w:start w:val="1"/>
+      <w:numFmt w:val="bullet"/>
+      <w:lvlText w:val="o"/>
+      <w:lvlJc w:val="left"/>
+      <w:pPr>
+        <w:ind w:left="2148" w:hanging="360"/>
+      </w:pPr>
+      <w:rPr>
+        <w:rFonts w:ascii="Courier New" w:hAnsi="Courier New" w:cs="Courier New" w:hint="default"/>
+      </w:rPr>
+    </w:lvl>
+    <w:lvl w:ilvl="2" w:tplc="04160005" w:tentative="1">
+      <w:start w:val="1"/>
+      <w:numFmt w:val="bullet"/>
+      <w:lvlText w:val=""/>
+      <w:lvlJc w:val="left"/>
+      <w:pPr>
+        <w:ind w:left="2868" w:hanging="360"/>
+      </w:pPr>
+      <w:rPr>
+        <w:rFonts w:ascii="Wingdings" w:hAnsi="Wingdings" w:hint="default"/>
+      </w:rPr>
+    </w:lvl>
+    <w:lvl w:ilvl="3" w:tplc="04160001" w:tentative="1">
+      <w:start w:val="1"/>
+      <w:numFmt w:val="bullet"/>
+      <w:lvlText w:val=""/>
+      <w:lvlJc w:val="left"/>
+      <w:pPr>
+        <w:ind w:left="3588" w:hanging="360"/>
+      </w:pPr>
+      <w:rPr>
+        <w:rFonts w:ascii="Symbol" w:hAnsi="Symbol" w:hint="default"/>
+      </w:rPr>
+    </w:lvl>
+    <w:lvl w:ilvl="4" w:tplc="04160003" w:tentative="1">
+      <w:start w:val="1"/>
+      <w:numFmt w:val="bullet"/>
+      <w:lvlText w:val="o"/>
+      <w:lvlJc w:val="left"/>
+      <w:pPr>
+        <w:ind w:left="4308" w:hanging="360"/>
+      </w:pPr>
+      <w:rPr>
+        <w:rFonts w:ascii="Courier New" w:hAnsi="Courier New" w:cs="Courier New" w:hint="default"/>
+      </w:rPr>
+    </w:lvl>
+    <w:lvl w:ilvl="5" w:tplc="04160005" w:tentative="1">
+      <w:start w:val="1"/>
+      <w:numFmt w:val="bullet"/>
+      <w:lvlText w:val=""/>
+      <w:lvlJc w:val="left"/>
+      <w:pPr>
+        <w:ind w:left="5028" w:hanging="360"/>
+      </w:pPr>
+      <w:rPr>
+        <w:rFonts w:ascii="Wingdings" w:hAnsi="Wingdings" w:hint="default"/>
+      </w:rPr>
+    </w:lvl>
+    <w:lvl w:ilvl="6" w:tplc="04160001" w:tentative="1">
+      <w:start w:val="1"/>
+      <w:numFmt w:val="bullet"/>
+      <w:lvlText w:val=""/>
+      <w:lvlJc w:val="left"/>
+      <w:pPr>
+        <w:ind w:left="5748" w:hanging="360"/>
+      </w:pPr>
+      <w:rPr>
+        <w:rFonts w:ascii="Symbol" w:hAnsi="Symbol" w:hint="default"/>
+      </w:rPr>
+    </w:lvl>
+    <w:lvl w:ilvl="7" w:tplc="04160003" w:tentative="1">
+      <w:start w:val="1"/>
+      <w:numFmt w:val="bullet"/>
+      <w:lvlText w:val="o"/>
+      <w:lvlJc w:val="left"/>
+      <w:pPr>
+        <w:ind w:left="6468" w:hanging="360"/>
+      </w:pPr>
+      <w:rPr>
+        <w:rFonts w:ascii="Courier New" w:hAnsi="Courier New" w:cs="Courier New" w:hint="default"/>
+      </w:rPr>
+    </w:lvl>
+    <w:lvl w:ilvl="8" w:tplc="04160005" w:tentative="1">
+      <w:start w:val="1"/>
+      <w:numFmt w:val="bullet"/>
+      <w:lvlText w:val=""/>
+      <w:lvlJc w:val="left"/>
+      <w:pPr>
+        <w:ind w:left="7188" w:hanging="360"/>
+      </w:pPr>
+      <w:rPr>
+        <w:rFonts w:ascii="Wingdings" w:hAnsi="Wingdings" w:hint="default"/>
       </w:rPr>
     </w:lvl>
   </w:abstractNum>
@@ -5153,6 +5103,24 @@
   </w:num>
   <w:num w:numId="9" w16cid:durableId="1854302531">
     <w:abstractNumId w:val="0"/>
+  </w:num>
+  <w:num w:numId="10" w16cid:durableId="252250304">
+    <w:abstractNumId w:val="12"/>
+  </w:num>
+  <w:num w:numId="11" w16cid:durableId="238714125">
+    <w:abstractNumId w:val="11"/>
+  </w:num>
+  <w:num w:numId="12" w16cid:durableId="132065698">
+    <w:abstractNumId w:val="13"/>
+  </w:num>
+  <w:num w:numId="13" w16cid:durableId="2002350235">
+    <w:abstractNumId w:val="10"/>
+  </w:num>
+  <w:num w:numId="14" w16cid:durableId="1062408069">
+    <w:abstractNumId w:val="9"/>
+  </w:num>
+  <w:num w:numId="15" w16cid:durableId="1941330993">
+    <w:abstractNumId w:val="7"/>
   </w:num>
 </w:numbering>
 </file>
@@ -5768,7 +5736,6 @@
   <w:style w:type="character" w:default="1" w:styleId="Fontepargpadro">
     <w:name w:val="Default Paragraph Font"/>
     <w:uiPriority w:val="1"/>
-    <w:semiHidden/>
     <w:unhideWhenUsed/>
   </w:style>
   <w:style w:type="table" w:default="1" w:styleId="Tabelanormal">

</xml_diff>